<commit_message>
Update guide documents with revised dates, improved structure, and corrected terminology
</commit_message>
<xml_diff>
--- a/02-phase2/docs/guide.docx
+++ b/02-phase2/docs/guide.docx
@@ -153,7 +153,7 @@
     <w:p/>
     <w:tbl>
       <w:tblPr>
-        <w:tblStyle w:val="TableGrid"/>
+        <w:tblStyle w:val="Tablaconcuadrcula"/>
         <w:tblW w:w="0" w:type="auto"/>
         <w:jc w:val="center"/>
         <w:tblLook w:val="04A0" w:firstRow="1" w:lastRow="0" w:firstColumn="1" w:lastColumn="0" w:noHBand="0" w:noVBand="1"/>
@@ -339,13 +339,13 @@
         <w:t xml:space="preserve">GUATEMALA </w:t>
       </w:r>
       <w:r>
-        <w:t>26</w:t>
+        <w:t>09</w:t>
       </w:r>
       <w:r>
         <w:t xml:space="preserve"> DE </w:t>
       </w:r>
       <w:r>
-        <w:t>MARZO</w:t>
+        <w:t>ABRIL</w:t>
       </w:r>
       <w:r>
         <w:t xml:space="preserve"> DEL AÑO 2026</w:t>
@@ -353,23 +353,30 @@
     </w:p>
     <w:p>
       <w:pPr>
-        <w:jc w:val="center"/>
-        <w:rPr>
-          <w:b/>
+        <w:pStyle w:val="Ttulo1"/>
+        <w:rPr>
           <w:lang w:val="en-US"/>
         </w:rPr>
       </w:pPr>
-      <w:r>
-        <w:rPr>
-          <w:b/>
+      <w:bookmarkStart w:id="0" w:name="_Toc226654617"/>
+      <w:r>
+        <w:rPr>
           <w:lang w:val="en-US"/>
         </w:rPr>
         <w:lastRenderedPageBreak/>
         <w:t>INDICE</w:t>
       </w:r>
+      <w:bookmarkEnd w:id="0"/>
     </w:p>
     <w:sdt>
       <w:sdtPr>
+        <w:rPr>
+          <w:rFonts w:ascii="Times New Roman" w:eastAsiaTheme="minorHAnsi" w:hAnsi="Times New Roman" w:cs="Times New Roman"/>
+          <w:color w:val="auto"/>
+          <w:sz w:val="24"/>
+          <w:szCs w:val="22"/>
+          <w:lang w:eastAsia="en-US"/>
+        </w:rPr>
         <w:id w:val="1182242591"/>
         <w:docPartObj>
           <w:docPartGallery w:val="Table of Contents"/>
@@ -378,30 +385,24 @@
       </w:sdtPr>
       <w:sdtEndPr>
         <w:rPr>
-          <w:rFonts w:ascii="Times New Roman" w:eastAsiaTheme="minorHAnsi" w:hAnsi="Times New Roman" w:cs="Times New Roman"/>
           <w:b/>
           <w:bCs/>
           <w:noProof/>
-          <w:color w:val="auto"/>
-          <w:sz w:val="24"/>
-          <w:szCs w:val="22"/>
-          <w:lang w:eastAsia="en-US"/>
         </w:rPr>
       </w:sdtEndPr>
       <w:sdtContent>
         <w:p>
           <w:pPr>
-            <w:pStyle w:val="TOCHeading"/>
+            <w:pStyle w:val="TtuloTDC"/>
+            <w:rPr>
+              <w:sz w:val="2"/>
+              <w:szCs w:val="2"/>
+            </w:rPr>
           </w:pPr>
-          <w:proofErr w:type="spellStart"/>
-          <w:r>
-            <w:t>Contents</w:t>
-          </w:r>
-          <w:proofErr w:type="spellEnd"/>
         </w:p>
         <w:p>
           <w:pPr>
-            <w:pStyle w:val="TOC1"/>
+            <w:pStyle w:val="TDC1"/>
             <w:tabs>
               <w:tab w:val="left" w:pos="480"/>
               <w:tab w:val="right" w:leader="dot" w:pos="9016"/>
@@ -411,7 +412,7 @@
               <w:noProof/>
               <w:kern w:val="2"/>
               <w:szCs w:val="24"/>
-              <w:lang w:val="en-US"/>
+              <w:lang w:val="es-GT" w:eastAsia="es-GT"/>
               <w14:ligatures w14:val="standardContextual"/>
             </w:rPr>
           </w:pPr>
@@ -424,12 +425,12 @@
           <w:r>
             <w:fldChar w:fldCharType="separate"/>
           </w:r>
-          <w:hyperlink w:anchor="_Toc226587296" w:history="1">
-            <w:r>
-              <w:rPr>
-                <w:rStyle w:val="Hyperlink"/>
+          <w:hyperlink w:anchor="_Toc226654617" w:history="1">
+            <w:r>
+              <w:rPr>
+                <w:rStyle w:val="Hipervnculo"/>
                 <w:noProof/>
-                <w:lang w:val="es-GT"/>
+                <w:lang w:val="en-US"/>
               </w:rPr>
               <w:t>1.</w:t>
             </w:r>
@@ -439,18 +440,18 @@
                 <w:noProof/>
                 <w:kern w:val="2"/>
                 <w:szCs w:val="24"/>
+                <w:lang w:val="es-GT" w:eastAsia="es-GT"/>
+                <w14:ligatures w14:val="standardContextual"/>
+              </w:rPr>
+              <w:tab/>
+            </w:r>
+            <w:r>
+              <w:rPr>
+                <w:rStyle w:val="Hipervnculo"/>
+                <w:noProof/>
                 <w:lang w:val="en-US"/>
-                <w14:ligatures w14:val="standardContextual"/>
-              </w:rPr>
-              <w:tab/>
-            </w:r>
-            <w:r>
-              <w:rPr>
-                <w:rStyle w:val="Hyperlink"/>
-                <w:noProof/>
-                <w:lang w:val="es-GT"/>
-              </w:rPr>
-              <w:t>Manuales de Instalación</w:t>
+              </w:rPr>
+              <w:t>INDICE</w:t>
             </w:r>
             <w:r>
               <w:rPr>
@@ -471,7 +472,7 @@
                 <w:noProof/>
                 <w:webHidden/>
               </w:rPr>
-              <w:instrText xml:space="preserve"> PAGEREF _Toc226587296 \h </w:instrText>
+              <w:instrText xml:space="preserve"> PAGEREF _Toc226654617 \h </w:instrText>
             </w:r>
             <w:r>
               <w:rPr>
@@ -491,7 +492,7 @@
                 <w:noProof/>
                 <w:webHidden/>
               </w:rPr>
-              <w:t>3</w:t>
+              <w:t>2</w:t>
             </w:r>
             <w:r>
               <w:rPr>
@@ -504,7 +505,101 @@
         </w:p>
         <w:p>
           <w:pPr>
-            <w:pStyle w:val="TOC2"/>
+            <w:pStyle w:val="TDC1"/>
+            <w:tabs>
+              <w:tab w:val="left" w:pos="480"/>
+              <w:tab w:val="right" w:leader="dot" w:pos="9016"/>
+            </w:tabs>
+            <w:rPr>
+              <w:rFonts w:asciiTheme="minorHAnsi" w:eastAsiaTheme="minorEastAsia" w:hAnsiTheme="minorHAnsi" w:cstheme="minorBidi"/>
+              <w:noProof/>
+              <w:kern w:val="2"/>
+              <w:szCs w:val="24"/>
+              <w:lang w:val="es-GT" w:eastAsia="es-GT"/>
+              <w14:ligatures w14:val="standardContextual"/>
+            </w:rPr>
+          </w:pPr>
+          <w:hyperlink w:anchor="_Toc226654618" w:history="1">
+            <w:r>
+              <w:rPr>
+                <w:rStyle w:val="Hipervnculo"/>
+                <w:noProof/>
+                <w:lang w:val="es-GT"/>
+              </w:rPr>
+              <w:t>2.</w:t>
+            </w:r>
+            <w:r>
+              <w:rPr>
+                <w:rFonts w:asciiTheme="minorHAnsi" w:eastAsiaTheme="minorEastAsia" w:hAnsiTheme="minorHAnsi" w:cstheme="minorBidi"/>
+                <w:noProof/>
+                <w:kern w:val="2"/>
+                <w:szCs w:val="24"/>
+                <w:lang w:val="es-GT" w:eastAsia="es-GT"/>
+                <w14:ligatures w14:val="standardContextual"/>
+              </w:rPr>
+              <w:tab/>
+            </w:r>
+            <w:r>
+              <w:rPr>
+                <w:rStyle w:val="Hipervnculo"/>
+                <w:noProof/>
+                <w:lang w:val="es-GT"/>
+              </w:rPr>
+              <w:t>Manuales de Instalación</w:t>
+            </w:r>
+            <w:r>
+              <w:rPr>
+                <w:noProof/>
+                <w:webHidden/>
+              </w:rPr>
+              <w:tab/>
+            </w:r>
+            <w:r>
+              <w:rPr>
+                <w:noProof/>
+                <w:webHidden/>
+              </w:rPr>
+              <w:fldChar w:fldCharType="begin"/>
+            </w:r>
+            <w:r>
+              <w:rPr>
+                <w:noProof/>
+                <w:webHidden/>
+              </w:rPr>
+              <w:instrText xml:space="preserve"> PAGEREF _Toc226654618 \h </w:instrText>
+            </w:r>
+            <w:r>
+              <w:rPr>
+                <w:noProof/>
+                <w:webHidden/>
+              </w:rPr>
+            </w:r>
+            <w:r>
+              <w:rPr>
+                <w:noProof/>
+                <w:webHidden/>
+              </w:rPr>
+              <w:fldChar w:fldCharType="separate"/>
+            </w:r>
+            <w:r>
+              <w:rPr>
+                <w:noProof/>
+                <w:webHidden/>
+              </w:rPr>
+              <w:t>3</w:t>
+            </w:r>
+            <w:r>
+              <w:rPr>
+                <w:noProof/>
+                <w:webHidden/>
+              </w:rPr>
+              <w:fldChar w:fldCharType="end"/>
+            </w:r>
+          </w:hyperlink>
+        </w:p>
+        <w:p>
+          <w:pPr>
+            <w:pStyle w:val="TDC2"/>
             <w:tabs>
               <w:tab w:val="left" w:pos="720"/>
               <w:tab w:val="right" w:leader="dot" w:pos="9016"/>
@@ -514,14 +609,14 @@
               <w:noProof/>
               <w:kern w:val="2"/>
               <w:szCs w:val="24"/>
-              <w:lang w:val="en-US"/>
+              <w:lang w:val="es-GT" w:eastAsia="es-GT"/>
               <w14:ligatures w14:val="standardContextual"/>
             </w:rPr>
           </w:pPr>
-          <w:hyperlink w:anchor="_Toc226587297" w:history="1">
-            <w:r>
-              <w:rPr>
-                <w:rStyle w:val="Hyperlink"/>
+          <w:hyperlink w:anchor="_Toc226654619" w:history="1">
+            <w:r>
+              <w:rPr>
+                <w:rStyle w:val="Hipervnculo"/>
                 <w:noProof/>
                 <w:lang w:val="es-GT"/>
               </w:rPr>
@@ -533,14 +628,14 @@
                 <w:noProof/>
                 <w:kern w:val="2"/>
                 <w:szCs w:val="24"/>
-                <w:lang w:val="en-US"/>
+                <w:lang w:val="es-GT" w:eastAsia="es-GT"/>
                 <w14:ligatures w14:val="standardContextual"/>
               </w:rPr>
               <w:tab/>
             </w:r>
             <w:r>
               <w:rPr>
-                <w:rStyle w:val="Hyperlink"/>
+                <w:rStyle w:val="Hipervnculo"/>
                 <w:noProof/>
                 <w:lang w:val="es-GT"/>
               </w:rPr>
@@ -565,7 +660,7 @@
                 <w:noProof/>
                 <w:webHidden/>
               </w:rPr>
-              <w:instrText xml:space="preserve"> PAGEREF _Toc226587297 \h </w:instrText>
+              <w:instrText xml:space="preserve"> PAGEREF _Toc226654619 \h </w:instrText>
             </w:r>
             <w:r>
               <w:rPr>
@@ -598,7 +693,7 @@
         </w:p>
         <w:p>
           <w:pPr>
-            <w:pStyle w:val="TOC3"/>
+            <w:pStyle w:val="TDC3"/>
             <w:tabs>
               <w:tab w:val="left" w:pos="960"/>
               <w:tab w:val="right" w:leader="dot" w:pos="9016"/>
@@ -608,14 +703,14 @@
               <w:noProof/>
               <w:kern w:val="2"/>
               <w:szCs w:val="24"/>
-              <w:lang w:val="en-US"/>
+              <w:lang w:val="es-GT" w:eastAsia="es-GT"/>
               <w14:ligatures w14:val="standardContextual"/>
             </w:rPr>
           </w:pPr>
-          <w:hyperlink w:anchor="_Toc226587298" w:history="1">
-            <w:r>
-              <w:rPr>
-                <w:rStyle w:val="Hyperlink"/>
+          <w:hyperlink w:anchor="_Toc226654620" w:history="1">
+            <w:r>
+              <w:rPr>
+                <w:rStyle w:val="Hipervnculo"/>
                 <w:noProof/>
                 <w:lang w:val="es-GT"/>
               </w:rPr>
@@ -627,14 +722,14 @@
                 <w:noProof/>
                 <w:kern w:val="2"/>
                 <w:szCs w:val="24"/>
-                <w:lang w:val="en-US"/>
+                <w:lang w:val="es-GT" w:eastAsia="es-GT"/>
                 <w14:ligatures w14:val="standardContextual"/>
               </w:rPr>
               <w:tab/>
             </w:r>
             <w:r>
               <w:rPr>
-                <w:rStyle w:val="Hyperlink"/>
+                <w:rStyle w:val="Hipervnculo"/>
                 <w:noProof/>
                 <w:lang w:val="es-GT"/>
               </w:rPr>
@@ -659,7 +754,7 @@
                 <w:noProof/>
                 <w:webHidden/>
               </w:rPr>
-              <w:instrText xml:space="preserve"> PAGEREF _Toc226587298 \h </w:instrText>
+              <w:instrText xml:space="preserve"> PAGEREF _Toc226654620 \h </w:instrText>
             </w:r>
             <w:r>
               <w:rPr>
@@ -692,7 +787,7 @@
         </w:p>
         <w:p>
           <w:pPr>
-            <w:pStyle w:val="TOC3"/>
+            <w:pStyle w:val="TDC3"/>
             <w:tabs>
               <w:tab w:val="left" w:pos="960"/>
               <w:tab w:val="right" w:leader="dot" w:pos="9016"/>
@@ -702,14 +797,14 @@
               <w:noProof/>
               <w:kern w:val="2"/>
               <w:szCs w:val="24"/>
-              <w:lang w:val="en-US"/>
+              <w:lang w:val="es-GT" w:eastAsia="es-GT"/>
               <w14:ligatures w14:val="standardContextual"/>
             </w:rPr>
           </w:pPr>
-          <w:hyperlink w:anchor="_Toc226587299" w:history="1">
-            <w:r>
-              <w:rPr>
-                <w:rStyle w:val="Hyperlink"/>
+          <w:hyperlink w:anchor="_Toc226654621" w:history="1">
+            <w:r>
+              <w:rPr>
+                <w:rStyle w:val="Hipervnculo"/>
                 <w:noProof/>
                 <w:lang w:val="es-GT"/>
               </w:rPr>
@@ -721,14 +816,14 @@
                 <w:noProof/>
                 <w:kern w:val="2"/>
                 <w:szCs w:val="24"/>
-                <w:lang w:val="en-US"/>
+                <w:lang w:val="es-GT" w:eastAsia="es-GT"/>
                 <w14:ligatures w14:val="standardContextual"/>
               </w:rPr>
               <w:tab/>
             </w:r>
             <w:r>
               <w:rPr>
-                <w:rStyle w:val="Hyperlink"/>
+                <w:rStyle w:val="Hipervnculo"/>
                 <w:noProof/>
                 <w:lang w:val="es-GT"/>
               </w:rPr>
@@ -753,7 +848,7 @@
                 <w:noProof/>
                 <w:webHidden/>
               </w:rPr>
-              <w:instrText xml:space="preserve"> PAGEREF _Toc226587299 \h </w:instrText>
+              <w:instrText xml:space="preserve"> PAGEREF _Toc226654621 \h </w:instrText>
             </w:r>
             <w:r>
               <w:rPr>
@@ -786,7 +881,7 @@
         </w:p>
         <w:p>
           <w:pPr>
-            <w:pStyle w:val="TOC3"/>
+            <w:pStyle w:val="TDC3"/>
             <w:tabs>
               <w:tab w:val="left" w:pos="960"/>
               <w:tab w:val="right" w:leader="dot" w:pos="9016"/>
@@ -796,14 +891,14 @@
               <w:noProof/>
               <w:kern w:val="2"/>
               <w:szCs w:val="24"/>
-              <w:lang w:val="en-US"/>
+              <w:lang w:val="es-GT" w:eastAsia="es-GT"/>
               <w14:ligatures w14:val="standardContextual"/>
             </w:rPr>
           </w:pPr>
-          <w:hyperlink w:anchor="_Toc226587300" w:history="1">
-            <w:r>
-              <w:rPr>
-                <w:rStyle w:val="Hyperlink"/>
+          <w:hyperlink w:anchor="_Toc226654622" w:history="1">
+            <w:r>
+              <w:rPr>
+                <w:rStyle w:val="Hipervnculo"/>
                 <w:noProof/>
                 <w:lang w:val="es-GT"/>
               </w:rPr>
@@ -815,14 +910,14 @@
                 <w:noProof/>
                 <w:kern w:val="2"/>
                 <w:szCs w:val="24"/>
-                <w:lang w:val="en-US"/>
+                <w:lang w:val="es-GT" w:eastAsia="es-GT"/>
                 <w14:ligatures w14:val="standardContextual"/>
               </w:rPr>
               <w:tab/>
             </w:r>
             <w:r>
               <w:rPr>
-                <w:rStyle w:val="Hyperlink"/>
+                <w:rStyle w:val="Hipervnculo"/>
                 <w:noProof/>
                 <w:lang w:val="es-GT"/>
               </w:rPr>
@@ -847,7 +942,7 @@
                 <w:noProof/>
                 <w:webHidden/>
               </w:rPr>
-              <w:instrText xml:space="preserve"> PAGEREF _Toc226587300 \h </w:instrText>
+              <w:instrText xml:space="preserve"> PAGEREF _Toc226654622 \h </w:instrText>
             </w:r>
             <w:r>
               <w:rPr>
@@ -880,7 +975,7 @@
         </w:p>
         <w:p>
           <w:pPr>
-            <w:pStyle w:val="TOC2"/>
+            <w:pStyle w:val="TDC2"/>
             <w:tabs>
               <w:tab w:val="left" w:pos="720"/>
               <w:tab w:val="right" w:leader="dot" w:pos="9016"/>
@@ -890,14 +985,14 @@
               <w:noProof/>
               <w:kern w:val="2"/>
               <w:szCs w:val="24"/>
-              <w:lang w:val="en-US"/>
+              <w:lang w:val="es-GT" w:eastAsia="es-GT"/>
               <w14:ligatures w14:val="standardContextual"/>
             </w:rPr>
           </w:pPr>
-          <w:hyperlink w:anchor="_Toc226587301" w:history="1">
-            <w:r>
-              <w:rPr>
-                <w:rStyle w:val="Hyperlink"/>
+          <w:hyperlink w:anchor="_Toc226654623" w:history="1">
+            <w:r>
+              <w:rPr>
+                <w:rStyle w:val="Hipervnculo"/>
                 <w:noProof/>
                 <w:lang w:val="es-GT"/>
               </w:rPr>
@@ -909,14 +1004,14 @@
                 <w:noProof/>
                 <w:kern w:val="2"/>
                 <w:szCs w:val="24"/>
-                <w:lang w:val="en-US"/>
+                <w:lang w:val="es-GT" w:eastAsia="es-GT"/>
                 <w14:ligatures w14:val="standardContextual"/>
               </w:rPr>
               <w:tab/>
             </w:r>
             <w:r>
               <w:rPr>
-                <w:rStyle w:val="Hyperlink"/>
+                <w:rStyle w:val="Hipervnculo"/>
                 <w:noProof/>
                 <w:lang w:val="es-GT"/>
               </w:rPr>
@@ -941,7 +1036,7 @@
                 <w:noProof/>
                 <w:webHidden/>
               </w:rPr>
-              <w:instrText xml:space="preserve"> PAGEREF _Toc226587301 \h </w:instrText>
+              <w:instrText xml:space="preserve"> PAGEREF _Toc226654623 \h </w:instrText>
             </w:r>
             <w:r>
               <w:rPr>
@@ -974,7 +1069,7 @@
         </w:p>
         <w:p>
           <w:pPr>
-            <w:pStyle w:val="TOC3"/>
+            <w:pStyle w:val="TDC3"/>
             <w:tabs>
               <w:tab w:val="left" w:pos="960"/>
               <w:tab w:val="right" w:leader="dot" w:pos="9016"/>
@@ -984,14 +1079,14 @@
               <w:noProof/>
               <w:kern w:val="2"/>
               <w:szCs w:val="24"/>
-              <w:lang w:val="en-US"/>
+              <w:lang w:val="es-GT" w:eastAsia="es-GT"/>
               <w14:ligatures w14:val="standardContextual"/>
             </w:rPr>
           </w:pPr>
-          <w:hyperlink w:anchor="_Toc226587302" w:history="1">
-            <w:r>
-              <w:rPr>
-                <w:rStyle w:val="Hyperlink"/>
+          <w:hyperlink w:anchor="_Toc226654624" w:history="1">
+            <w:r>
+              <w:rPr>
+                <w:rStyle w:val="Hipervnculo"/>
                 <w:noProof/>
                 <w:lang w:val="es-GT"/>
               </w:rPr>
@@ -1003,14 +1098,14 @@
                 <w:noProof/>
                 <w:kern w:val="2"/>
                 <w:szCs w:val="24"/>
-                <w:lang w:val="en-US"/>
+                <w:lang w:val="es-GT" w:eastAsia="es-GT"/>
                 <w14:ligatures w14:val="standardContextual"/>
               </w:rPr>
               <w:tab/>
             </w:r>
             <w:r>
               <w:rPr>
-                <w:rStyle w:val="Hyperlink"/>
+                <w:rStyle w:val="Hipervnculo"/>
                 <w:noProof/>
                 <w:lang w:val="es-GT"/>
               </w:rPr>
@@ -1035,7 +1130,7 @@
                 <w:noProof/>
                 <w:webHidden/>
               </w:rPr>
-              <w:instrText xml:space="preserve"> PAGEREF _Toc226587302 \h </w:instrText>
+              <w:instrText xml:space="preserve"> PAGEREF _Toc226654624 \h </w:instrText>
             </w:r>
             <w:r>
               <w:rPr>
@@ -1068,7 +1163,7 @@
         </w:p>
         <w:p>
           <w:pPr>
-            <w:pStyle w:val="TOC3"/>
+            <w:pStyle w:val="TDC3"/>
             <w:tabs>
               <w:tab w:val="left" w:pos="960"/>
               <w:tab w:val="right" w:leader="dot" w:pos="9016"/>
@@ -1078,14 +1173,14 @@
               <w:noProof/>
               <w:kern w:val="2"/>
               <w:szCs w:val="24"/>
-              <w:lang w:val="en-US"/>
+              <w:lang w:val="es-GT" w:eastAsia="es-GT"/>
               <w14:ligatures w14:val="standardContextual"/>
             </w:rPr>
           </w:pPr>
-          <w:hyperlink w:anchor="_Toc226587303" w:history="1">
-            <w:r>
-              <w:rPr>
-                <w:rStyle w:val="Hyperlink"/>
+          <w:hyperlink w:anchor="_Toc226654625" w:history="1">
+            <w:r>
+              <w:rPr>
+                <w:rStyle w:val="Hipervnculo"/>
                 <w:noProof/>
                 <w:lang w:val="es-GT"/>
               </w:rPr>
@@ -1097,14 +1192,14 @@
                 <w:noProof/>
                 <w:kern w:val="2"/>
                 <w:szCs w:val="24"/>
-                <w:lang w:val="en-US"/>
+                <w:lang w:val="es-GT" w:eastAsia="es-GT"/>
                 <w14:ligatures w14:val="standardContextual"/>
               </w:rPr>
               <w:tab/>
             </w:r>
             <w:r>
               <w:rPr>
-                <w:rStyle w:val="Hyperlink"/>
+                <w:rStyle w:val="Hipervnculo"/>
                 <w:noProof/>
                 <w:lang w:val="es-GT"/>
               </w:rPr>
@@ -1129,7 +1224,7 @@
                 <w:noProof/>
                 <w:webHidden/>
               </w:rPr>
-              <w:instrText xml:space="preserve"> PAGEREF _Toc226587303 \h </w:instrText>
+              <w:instrText xml:space="preserve"> PAGEREF _Toc226654625 \h </w:instrText>
             </w:r>
             <w:r>
               <w:rPr>
@@ -1162,7 +1257,7 @@
         </w:p>
         <w:p>
           <w:pPr>
-            <w:pStyle w:val="TOC3"/>
+            <w:pStyle w:val="TDC3"/>
             <w:tabs>
               <w:tab w:val="left" w:pos="960"/>
               <w:tab w:val="right" w:leader="dot" w:pos="9016"/>
@@ -1172,14 +1267,14 @@
               <w:noProof/>
               <w:kern w:val="2"/>
               <w:szCs w:val="24"/>
-              <w:lang w:val="en-US"/>
+              <w:lang w:val="es-GT" w:eastAsia="es-GT"/>
               <w14:ligatures w14:val="standardContextual"/>
             </w:rPr>
           </w:pPr>
-          <w:hyperlink w:anchor="_Toc226587304" w:history="1">
-            <w:r>
-              <w:rPr>
-                <w:rStyle w:val="Hyperlink"/>
+          <w:hyperlink w:anchor="_Toc226654626" w:history="1">
+            <w:r>
+              <w:rPr>
+                <w:rStyle w:val="Hipervnculo"/>
                 <w:noProof/>
                 <w:lang w:val="es-GT"/>
               </w:rPr>
@@ -1191,14 +1286,14 @@
                 <w:noProof/>
                 <w:kern w:val="2"/>
                 <w:szCs w:val="24"/>
-                <w:lang w:val="en-US"/>
+                <w:lang w:val="es-GT" w:eastAsia="es-GT"/>
                 <w14:ligatures w14:val="standardContextual"/>
               </w:rPr>
               <w:tab/>
             </w:r>
             <w:r>
               <w:rPr>
-                <w:rStyle w:val="Hyperlink"/>
+                <w:rStyle w:val="Hipervnculo"/>
                 <w:noProof/>
                 <w:lang w:val="es-GT"/>
               </w:rPr>
@@ -1223,7 +1318,7 @@
                 <w:noProof/>
                 <w:webHidden/>
               </w:rPr>
-              <w:instrText xml:space="preserve"> PAGEREF _Toc226587304 \h </w:instrText>
+              <w:instrText xml:space="preserve"> PAGEREF _Toc226654626 \h </w:instrText>
             </w:r>
             <w:r>
               <w:rPr>
@@ -1256,7 +1351,7 @@
         </w:p>
         <w:p>
           <w:pPr>
-            <w:pStyle w:val="TOC2"/>
+            <w:pStyle w:val="TDC2"/>
             <w:tabs>
               <w:tab w:val="left" w:pos="720"/>
               <w:tab w:val="right" w:leader="dot" w:pos="9016"/>
@@ -1266,14 +1361,14 @@
               <w:noProof/>
               <w:kern w:val="2"/>
               <w:szCs w:val="24"/>
-              <w:lang w:val="en-US"/>
+              <w:lang w:val="es-GT" w:eastAsia="es-GT"/>
               <w14:ligatures w14:val="standardContextual"/>
             </w:rPr>
           </w:pPr>
-          <w:hyperlink w:anchor="_Toc226587305" w:history="1">
-            <w:r>
-              <w:rPr>
-                <w:rStyle w:val="Hyperlink"/>
+          <w:hyperlink w:anchor="_Toc226654627" w:history="1">
+            <w:r>
+              <w:rPr>
+                <w:rStyle w:val="Hipervnculo"/>
                 <w:noProof/>
               </w:rPr>
               <w:t>c.</w:t>
@@ -1284,17 +1379,17 @@
                 <w:noProof/>
                 <w:kern w:val="2"/>
                 <w:szCs w:val="24"/>
-                <w:lang w:val="en-US"/>
+                <w:lang w:val="es-GT" w:eastAsia="es-GT"/>
                 <w14:ligatures w14:val="standardContextual"/>
               </w:rPr>
               <w:tab/>
             </w:r>
             <w:r>
               <w:rPr>
-                <w:rStyle w:val="Hyperlink"/>
+                <w:rStyle w:val="Hipervnculo"/>
                 <w:noProof/>
               </w:rPr>
-              <w:t>Bienvenido a Odoo</w:t>
+              <w:t>Bienvenida a Odoo</w:t>
             </w:r>
             <w:r>
               <w:rPr>
@@ -1315,7 +1410,7 @@
                 <w:noProof/>
                 <w:webHidden/>
               </w:rPr>
-              <w:instrText xml:space="preserve"> PAGEREF _Toc226587305 \h </w:instrText>
+              <w:instrText xml:space="preserve"> PAGEREF _Toc226654627 \h </w:instrText>
             </w:r>
             <w:r>
               <w:rPr>
@@ -1336,6 +1431,757 @@
                 <w:webHidden/>
               </w:rPr>
               <w:t>15</w:t>
+            </w:r>
+            <w:r>
+              <w:rPr>
+                <w:noProof/>
+                <w:webHidden/>
+              </w:rPr>
+              <w:fldChar w:fldCharType="end"/>
+            </w:r>
+          </w:hyperlink>
+        </w:p>
+        <w:p>
+          <w:pPr>
+            <w:pStyle w:val="TDC3"/>
+            <w:tabs>
+              <w:tab w:val="left" w:pos="960"/>
+              <w:tab w:val="right" w:leader="dot" w:pos="9016"/>
+            </w:tabs>
+            <w:rPr>
+              <w:rFonts w:asciiTheme="minorHAnsi" w:eastAsiaTheme="minorEastAsia" w:hAnsiTheme="minorHAnsi" w:cstheme="minorBidi"/>
+              <w:noProof/>
+              <w:kern w:val="2"/>
+              <w:szCs w:val="24"/>
+              <w:lang w:val="es-GT" w:eastAsia="es-GT"/>
+              <w14:ligatures w14:val="standardContextual"/>
+            </w:rPr>
+          </w:pPr>
+          <w:hyperlink w:anchor="_Toc226654628" w:history="1">
+            <w:r>
+              <w:rPr>
+                <w:rStyle w:val="Hipervnculo"/>
+                <w:noProof/>
+                <w:lang w:val="es-GT"/>
+              </w:rPr>
+              <w:t>a.</w:t>
+            </w:r>
+            <w:r>
+              <w:rPr>
+                <w:rFonts w:asciiTheme="minorHAnsi" w:eastAsiaTheme="minorEastAsia" w:hAnsiTheme="minorHAnsi" w:cstheme="minorBidi"/>
+                <w:noProof/>
+                <w:kern w:val="2"/>
+                <w:szCs w:val="24"/>
+                <w:lang w:val="es-GT" w:eastAsia="es-GT"/>
+                <w14:ligatures w14:val="standardContextual"/>
+              </w:rPr>
+              <w:tab/>
+            </w:r>
+            <w:r>
+              <w:rPr>
+                <w:rStyle w:val="Hipervnculo"/>
+                <w:noProof/>
+                <w:lang w:val="es-GT"/>
+              </w:rPr>
+              <w:t>Carga masiva de Productos</w:t>
+            </w:r>
+            <w:r>
+              <w:rPr>
+                <w:noProof/>
+                <w:webHidden/>
+              </w:rPr>
+              <w:tab/>
+            </w:r>
+            <w:r>
+              <w:rPr>
+                <w:noProof/>
+                <w:webHidden/>
+              </w:rPr>
+              <w:fldChar w:fldCharType="begin"/>
+            </w:r>
+            <w:r>
+              <w:rPr>
+                <w:noProof/>
+                <w:webHidden/>
+              </w:rPr>
+              <w:instrText xml:space="preserve"> PAGEREF _Toc226654628 \h </w:instrText>
+            </w:r>
+            <w:r>
+              <w:rPr>
+                <w:noProof/>
+                <w:webHidden/>
+              </w:rPr>
+            </w:r>
+            <w:r>
+              <w:rPr>
+                <w:noProof/>
+                <w:webHidden/>
+              </w:rPr>
+              <w:fldChar w:fldCharType="separate"/>
+            </w:r>
+            <w:r>
+              <w:rPr>
+                <w:noProof/>
+                <w:webHidden/>
+              </w:rPr>
+              <w:t>15</w:t>
+            </w:r>
+            <w:r>
+              <w:rPr>
+                <w:noProof/>
+                <w:webHidden/>
+              </w:rPr>
+              <w:fldChar w:fldCharType="end"/>
+            </w:r>
+          </w:hyperlink>
+        </w:p>
+        <w:p>
+          <w:pPr>
+            <w:pStyle w:val="TDC3"/>
+            <w:tabs>
+              <w:tab w:val="left" w:pos="960"/>
+              <w:tab w:val="right" w:leader="dot" w:pos="9016"/>
+            </w:tabs>
+            <w:rPr>
+              <w:rFonts w:asciiTheme="minorHAnsi" w:eastAsiaTheme="minorEastAsia" w:hAnsiTheme="minorHAnsi" w:cstheme="minorBidi"/>
+              <w:noProof/>
+              <w:kern w:val="2"/>
+              <w:szCs w:val="24"/>
+              <w:lang w:val="es-GT" w:eastAsia="es-GT"/>
+              <w14:ligatures w14:val="standardContextual"/>
+            </w:rPr>
+          </w:pPr>
+          <w:hyperlink w:anchor="_Toc226654629" w:history="1">
+            <w:r>
+              <w:rPr>
+                <w:rStyle w:val="Hipervnculo"/>
+                <w:noProof/>
+                <w:lang w:val="es-GT"/>
+              </w:rPr>
+              <w:t>b.</w:t>
+            </w:r>
+            <w:r>
+              <w:rPr>
+                <w:rFonts w:asciiTheme="minorHAnsi" w:eastAsiaTheme="minorEastAsia" w:hAnsiTheme="minorHAnsi" w:cstheme="minorBidi"/>
+                <w:noProof/>
+                <w:kern w:val="2"/>
+                <w:szCs w:val="24"/>
+                <w:lang w:val="es-GT" w:eastAsia="es-GT"/>
+                <w14:ligatures w14:val="standardContextual"/>
+              </w:rPr>
+              <w:tab/>
+            </w:r>
+            <w:r>
+              <w:rPr>
+                <w:rStyle w:val="Hipervnculo"/>
+                <w:noProof/>
+                <w:lang w:val="es-GT"/>
+              </w:rPr>
+              <w:t>Carga masiva de Clientes y Proveedores</w:t>
+            </w:r>
+            <w:r>
+              <w:rPr>
+                <w:noProof/>
+                <w:webHidden/>
+              </w:rPr>
+              <w:tab/>
+            </w:r>
+            <w:r>
+              <w:rPr>
+                <w:noProof/>
+                <w:webHidden/>
+              </w:rPr>
+              <w:fldChar w:fldCharType="begin"/>
+            </w:r>
+            <w:r>
+              <w:rPr>
+                <w:noProof/>
+                <w:webHidden/>
+              </w:rPr>
+              <w:instrText xml:space="preserve"> PAGEREF _Toc226654629 \h </w:instrText>
+            </w:r>
+            <w:r>
+              <w:rPr>
+                <w:noProof/>
+                <w:webHidden/>
+              </w:rPr>
+            </w:r>
+            <w:r>
+              <w:rPr>
+                <w:noProof/>
+                <w:webHidden/>
+              </w:rPr>
+              <w:fldChar w:fldCharType="separate"/>
+            </w:r>
+            <w:r>
+              <w:rPr>
+                <w:noProof/>
+                <w:webHidden/>
+              </w:rPr>
+              <w:t>17</w:t>
+            </w:r>
+            <w:r>
+              <w:rPr>
+                <w:noProof/>
+                <w:webHidden/>
+              </w:rPr>
+              <w:fldChar w:fldCharType="end"/>
+            </w:r>
+          </w:hyperlink>
+        </w:p>
+        <w:p>
+          <w:pPr>
+            <w:pStyle w:val="TDC2"/>
+            <w:tabs>
+              <w:tab w:val="left" w:pos="720"/>
+              <w:tab w:val="right" w:leader="dot" w:pos="9016"/>
+            </w:tabs>
+            <w:rPr>
+              <w:rFonts w:asciiTheme="minorHAnsi" w:eastAsiaTheme="minorEastAsia" w:hAnsiTheme="minorHAnsi" w:cstheme="minorBidi"/>
+              <w:noProof/>
+              <w:kern w:val="2"/>
+              <w:szCs w:val="24"/>
+              <w:lang w:val="es-GT" w:eastAsia="es-GT"/>
+              <w14:ligatures w14:val="standardContextual"/>
+            </w:rPr>
+          </w:pPr>
+          <w:hyperlink w:anchor="_Toc226654630" w:history="1">
+            <w:r>
+              <w:rPr>
+                <w:rStyle w:val="Hipervnculo"/>
+                <w:noProof/>
+              </w:rPr>
+              <w:t>d.</w:t>
+            </w:r>
+            <w:r>
+              <w:rPr>
+                <w:rFonts w:asciiTheme="minorHAnsi" w:eastAsiaTheme="minorEastAsia" w:hAnsiTheme="minorHAnsi" w:cstheme="minorBidi"/>
+                <w:noProof/>
+                <w:kern w:val="2"/>
+                <w:szCs w:val="24"/>
+                <w:lang w:val="es-GT" w:eastAsia="es-GT"/>
+                <w14:ligatures w14:val="standardContextual"/>
+              </w:rPr>
+              <w:tab/>
+            </w:r>
+            <w:r>
+              <w:rPr>
+                <w:rStyle w:val="Hipervnculo"/>
+                <w:noProof/>
+                <w:lang w:val="es-GT"/>
+              </w:rPr>
+              <w:t>CRM y ERP</w:t>
+            </w:r>
+            <w:r>
+              <w:rPr>
+                <w:noProof/>
+                <w:webHidden/>
+              </w:rPr>
+              <w:tab/>
+            </w:r>
+            <w:r>
+              <w:rPr>
+                <w:noProof/>
+                <w:webHidden/>
+              </w:rPr>
+              <w:fldChar w:fldCharType="begin"/>
+            </w:r>
+            <w:r>
+              <w:rPr>
+                <w:noProof/>
+                <w:webHidden/>
+              </w:rPr>
+              <w:instrText xml:space="preserve"> PAGEREF _Toc226654630 \h </w:instrText>
+            </w:r>
+            <w:r>
+              <w:rPr>
+                <w:noProof/>
+                <w:webHidden/>
+              </w:rPr>
+            </w:r>
+            <w:r>
+              <w:rPr>
+                <w:noProof/>
+                <w:webHidden/>
+              </w:rPr>
+              <w:fldChar w:fldCharType="separate"/>
+            </w:r>
+            <w:r>
+              <w:rPr>
+                <w:noProof/>
+                <w:webHidden/>
+              </w:rPr>
+              <w:t>19</w:t>
+            </w:r>
+            <w:r>
+              <w:rPr>
+                <w:noProof/>
+                <w:webHidden/>
+              </w:rPr>
+              <w:fldChar w:fldCharType="end"/>
+            </w:r>
+          </w:hyperlink>
+        </w:p>
+        <w:p>
+          <w:pPr>
+            <w:pStyle w:val="TDC3"/>
+            <w:tabs>
+              <w:tab w:val="left" w:pos="960"/>
+              <w:tab w:val="right" w:leader="dot" w:pos="9016"/>
+            </w:tabs>
+            <w:rPr>
+              <w:rFonts w:asciiTheme="minorHAnsi" w:eastAsiaTheme="minorEastAsia" w:hAnsiTheme="minorHAnsi" w:cstheme="minorBidi"/>
+              <w:noProof/>
+              <w:kern w:val="2"/>
+              <w:szCs w:val="24"/>
+              <w:lang w:val="es-GT" w:eastAsia="es-GT"/>
+              <w14:ligatures w14:val="standardContextual"/>
+            </w:rPr>
+          </w:pPr>
+          <w:hyperlink w:anchor="_Toc226654631" w:history="1">
+            <w:r>
+              <w:rPr>
+                <w:rStyle w:val="Hipervnculo"/>
+                <w:noProof/>
+                <w:lang w:val="es-GT"/>
+              </w:rPr>
+              <w:t>a.</w:t>
+            </w:r>
+            <w:r>
+              <w:rPr>
+                <w:rFonts w:asciiTheme="minorHAnsi" w:eastAsiaTheme="minorEastAsia" w:hAnsiTheme="minorHAnsi" w:cstheme="minorBidi"/>
+                <w:noProof/>
+                <w:kern w:val="2"/>
+                <w:szCs w:val="24"/>
+                <w:lang w:val="es-GT" w:eastAsia="es-GT"/>
+                <w14:ligatures w14:val="standardContextual"/>
+              </w:rPr>
+              <w:tab/>
+            </w:r>
+            <w:r>
+              <w:rPr>
+                <w:rStyle w:val="Hipervnculo"/>
+                <w:noProof/>
+                <w:lang w:val="es-GT"/>
+              </w:rPr>
+              <w:t>ERP (ventas, compras, inventario)</w:t>
+            </w:r>
+            <w:r>
+              <w:rPr>
+                <w:noProof/>
+                <w:webHidden/>
+              </w:rPr>
+              <w:tab/>
+            </w:r>
+            <w:r>
+              <w:rPr>
+                <w:noProof/>
+                <w:webHidden/>
+              </w:rPr>
+              <w:fldChar w:fldCharType="begin"/>
+            </w:r>
+            <w:r>
+              <w:rPr>
+                <w:noProof/>
+                <w:webHidden/>
+              </w:rPr>
+              <w:instrText xml:space="preserve"> PAGEREF _Toc226654631 \h </w:instrText>
+            </w:r>
+            <w:r>
+              <w:rPr>
+                <w:noProof/>
+                <w:webHidden/>
+              </w:rPr>
+            </w:r>
+            <w:r>
+              <w:rPr>
+                <w:noProof/>
+                <w:webHidden/>
+              </w:rPr>
+              <w:fldChar w:fldCharType="separate"/>
+            </w:r>
+            <w:r>
+              <w:rPr>
+                <w:noProof/>
+                <w:webHidden/>
+              </w:rPr>
+              <w:t>19</w:t>
+            </w:r>
+            <w:r>
+              <w:rPr>
+                <w:noProof/>
+                <w:webHidden/>
+              </w:rPr>
+              <w:fldChar w:fldCharType="end"/>
+            </w:r>
+          </w:hyperlink>
+        </w:p>
+        <w:p>
+          <w:pPr>
+            <w:pStyle w:val="TDC3"/>
+            <w:tabs>
+              <w:tab w:val="left" w:pos="960"/>
+              <w:tab w:val="right" w:leader="dot" w:pos="9016"/>
+            </w:tabs>
+            <w:rPr>
+              <w:rFonts w:asciiTheme="minorHAnsi" w:eastAsiaTheme="minorEastAsia" w:hAnsiTheme="minorHAnsi" w:cstheme="minorBidi"/>
+              <w:noProof/>
+              <w:kern w:val="2"/>
+              <w:szCs w:val="24"/>
+              <w:lang w:val="es-GT" w:eastAsia="es-GT"/>
+              <w14:ligatures w14:val="standardContextual"/>
+            </w:rPr>
+          </w:pPr>
+          <w:hyperlink w:anchor="_Toc226654632" w:history="1">
+            <w:r>
+              <w:rPr>
+                <w:rStyle w:val="Hipervnculo"/>
+                <w:noProof/>
+                <w:lang w:val="es-GT"/>
+              </w:rPr>
+              <w:t>b.</w:t>
+            </w:r>
+            <w:r>
+              <w:rPr>
+                <w:rFonts w:asciiTheme="minorHAnsi" w:eastAsiaTheme="minorEastAsia" w:hAnsiTheme="minorHAnsi" w:cstheme="minorBidi"/>
+                <w:noProof/>
+                <w:kern w:val="2"/>
+                <w:szCs w:val="24"/>
+                <w:lang w:val="es-GT" w:eastAsia="es-GT"/>
+                <w14:ligatures w14:val="standardContextual"/>
+              </w:rPr>
+              <w:tab/>
+            </w:r>
+            <w:r>
+              <w:rPr>
+                <w:rStyle w:val="Hipervnculo"/>
+                <w:noProof/>
+                <w:lang w:val="es-GT"/>
+              </w:rPr>
+              <w:t>CRM</w:t>
+            </w:r>
+            <w:r>
+              <w:rPr>
+                <w:noProof/>
+                <w:webHidden/>
+              </w:rPr>
+              <w:tab/>
+            </w:r>
+            <w:r>
+              <w:rPr>
+                <w:noProof/>
+                <w:webHidden/>
+              </w:rPr>
+              <w:fldChar w:fldCharType="begin"/>
+            </w:r>
+            <w:r>
+              <w:rPr>
+                <w:noProof/>
+                <w:webHidden/>
+              </w:rPr>
+              <w:instrText xml:space="preserve"> PAGEREF _Toc226654632 \h </w:instrText>
+            </w:r>
+            <w:r>
+              <w:rPr>
+                <w:noProof/>
+                <w:webHidden/>
+              </w:rPr>
+            </w:r>
+            <w:r>
+              <w:rPr>
+                <w:noProof/>
+                <w:webHidden/>
+              </w:rPr>
+              <w:fldChar w:fldCharType="separate"/>
+            </w:r>
+            <w:r>
+              <w:rPr>
+                <w:noProof/>
+                <w:webHidden/>
+              </w:rPr>
+              <w:t>20</w:t>
+            </w:r>
+            <w:r>
+              <w:rPr>
+                <w:noProof/>
+                <w:webHidden/>
+              </w:rPr>
+              <w:fldChar w:fldCharType="end"/>
+            </w:r>
+          </w:hyperlink>
+        </w:p>
+        <w:p>
+          <w:pPr>
+            <w:pStyle w:val="TDC3"/>
+            <w:tabs>
+              <w:tab w:val="left" w:pos="960"/>
+              <w:tab w:val="right" w:leader="dot" w:pos="9016"/>
+            </w:tabs>
+            <w:rPr>
+              <w:rFonts w:asciiTheme="minorHAnsi" w:eastAsiaTheme="minorEastAsia" w:hAnsiTheme="minorHAnsi" w:cstheme="minorBidi"/>
+              <w:noProof/>
+              <w:kern w:val="2"/>
+              <w:szCs w:val="24"/>
+              <w:lang w:val="es-GT" w:eastAsia="es-GT"/>
+              <w14:ligatures w14:val="standardContextual"/>
+            </w:rPr>
+          </w:pPr>
+          <w:hyperlink w:anchor="_Toc226654633" w:history="1">
+            <w:r>
+              <w:rPr>
+                <w:rStyle w:val="Hipervnculo"/>
+                <w:noProof/>
+                <w:lang w:val="en-US"/>
+              </w:rPr>
+              <w:t>c.</w:t>
+            </w:r>
+            <w:r>
+              <w:rPr>
+                <w:rFonts w:asciiTheme="minorHAnsi" w:eastAsiaTheme="minorEastAsia" w:hAnsiTheme="minorHAnsi" w:cstheme="minorBidi"/>
+                <w:noProof/>
+                <w:kern w:val="2"/>
+                <w:szCs w:val="24"/>
+                <w:lang w:val="es-GT" w:eastAsia="es-GT"/>
+                <w14:ligatures w14:val="standardContextual"/>
+              </w:rPr>
+              <w:tab/>
+            </w:r>
+            <w:r>
+              <w:rPr>
+                <w:rStyle w:val="Hipervnculo"/>
+                <w:noProof/>
+                <w:lang w:val="en-US"/>
+              </w:rPr>
+              <w:t>Compras a proveedores</w:t>
+            </w:r>
+            <w:r>
+              <w:rPr>
+                <w:noProof/>
+                <w:webHidden/>
+              </w:rPr>
+              <w:tab/>
+            </w:r>
+            <w:r>
+              <w:rPr>
+                <w:noProof/>
+                <w:webHidden/>
+              </w:rPr>
+              <w:fldChar w:fldCharType="begin"/>
+            </w:r>
+            <w:r>
+              <w:rPr>
+                <w:noProof/>
+                <w:webHidden/>
+              </w:rPr>
+              <w:instrText xml:space="preserve"> PAGEREF _Toc226654633 \h </w:instrText>
+            </w:r>
+            <w:r>
+              <w:rPr>
+                <w:noProof/>
+                <w:webHidden/>
+              </w:rPr>
+            </w:r>
+            <w:r>
+              <w:rPr>
+                <w:noProof/>
+                <w:webHidden/>
+              </w:rPr>
+              <w:fldChar w:fldCharType="separate"/>
+            </w:r>
+            <w:r>
+              <w:rPr>
+                <w:noProof/>
+                <w:webHidden/>
+              </w:rPr>
+              <w:t>20</w:t>
+            </w:r>
+            <w:r>
+              <w:rPr>
+                <w:noProof/>
+                <w:webHidden/>
+              </w:rPr>
+              <w:fldChar w:fldCharType="end"/>
+            </w:r>
+          </w:hyperlink>
+        </w:p>
+        <w:p>
+          <w:pPr>
+            <w:pStyle w:val="TDC3"/>
+            <w:tabs>
+              <w:tab w:val="left" w:pos="960"/>
+              <w:tab w:val="right" w:leader="dot" w:pos="9016"/>
+            </w:tabs>
+            <w:rPr>
+              <w:rFonts w:asciiTheme="minorHAnsi" w:eastAsiaTheme="minorEastAsia" w:hAnsiTheme="minorHAnsi" w:cstheme="minorBidi"/>
+              <w:noProof/>
+              <w:kern w:val="2"/>
+              <w:szCs w:val="24"/>
+              <w:lang w:val="es-GT" w:eastAsia="es-GT"/>
+              <w14:ligatures w14:val="standardContextual"/>
+            </w:rPr>
+          </w:pPr>
+          <w:hyperlink w:anchor="_Toc226654634" w:history="1">
+            <w:r>
+              <w:rPr>
+                <w:rStyle w:val="Hipervnculo"/>
+                <w:noProof/>
+                <w:lang w:val="es-GT"/>
+              </w:rPr>
+              <w:t>d.</w:t>
+            </w:r>
+            <w:r>
+              <w:rPr>
+                <w:rFonts w:asciiTheme="minorHAnsi" w:eastAsiaTheme="minorEastAsia" w:hAnsiTheme="minorHAnsi" w:cstheme="minorBidi"/>
+                <w:noProof/>
+                <w:kern w:val="2"/>
+                <w:szCs w:val="24"/>
+                <w:lang w:val="es-GT" w:eastAsia="es-GT"/>
+                <w14:ligatures w14:val="standardContextual"/>
+              </w:rPr>
+              <w:tab/>
+            </w:r>
+            <w:r>
+              <w:rPr>
+                <w:rStyle w:val="Hipervnculo"/>
+                <w:noProof/>
+                <w:lang w:val="es-GT"/>
+              </w:rPr>
+              <w:t>Cotizaciones de Productos</w:t>
+            </w:r>
+            <w:r>
+              <w:rPr>
+                <w:noProof/>
+                <w:webHidden/>
+              </w:rPr>
+              <w:tab/>
+            </w:r>
+            <w:r>
+              <w:rPr>
+                <w:noProof/>
+                <w:webHidden/>
+              </w:rPr>
+              <w:fldChar w:fldCharType="begin"/>
+            </w:r>
+            <w:r>
+              <w:rPr>
+                <w:noProof/>
+                <w:webHidden/>
+              </w:rPr>
+              <w:instrText xml:space="preserve"> PAGEREF _Toc226654634 \h </w:instrText>
+            </w:r>
+            <w:r>
+              <w:rPr>
+                <w:noProof/>
+                <w:webHidden/>
+              </w:rPr>
+            </w:r>
+            <w:r>
+              <w:rPr>
+                <w:noProof/>
+                <w:webHidden/>
+              </w:rPr>
+              <w:fldChar w:fldCharType="separate"/>
+            </w:r>
+            <w:r>
+              <w:rPr>
+                <w:noProof/>
+                <w:webHidden/>
+              </w:rPr>
+              <w:t>22</w:t>
+            </w:r>
+            <w:r>
+              <w:rPr>
+                <w:noProof/>
+                <w:webHidden/>
+              </w:rPr>
+              <w:fldChar w:fldCharType="end"/>
+            </w:r>
+          </w:hyperlink>
+        </w:p>
+        <w:p>
+          <w:pPr>
+            <w:pStyle w:val="TDC3"/>
+            <w:tabs>
+              <w:tab w:val="left" w:pos="960"/>
+              <w:tab w:val="right" w:leader="dot" w:pos="9016"/>
+            </w:tabs>
+            <w:rPr>
+              <w:rFonts w:asciiTheme="minorHAnsi" w:eastAsiaTheme="minorEastAsia" w:hAnsiTheme="minorHAnsi" w:cstheme="minorBidi"/>
+              <w:noProof/>
+              <w:kern w:val="2"/>
+              <w:szCs w:val="24"/>
+              <w:lang w:val="es-GT" w:eastAsia="es-GT"/>
+              <w14:ligatures w14:val="standardContextual"/>
+            </w:rPr>
+          </w:pPr>
+          <w:hyperlink w:anchor="_Toc226654635" w:history="1">
+            <w:r>
+              <w:rPr>
+                <w:rStyle w:val="Hipervnculo"/>
+                <w:noProof/>
+                <w:lang w:val="en-US"/>
+              </w:rPr>
+              <w:t>e.</w:t>
+            </w:r>
+            <w:r>
+              <w:rPr>
+                <w:rFonts w:asciiTheme="minorHAnsi" w:eastAsiaTheme="minorEastAsia" w:hAnsiTheme="minorHAnsi" w:cstheme="minorBidi"/>
+                <w:noProof/>
+                <w:kern w:val="2"/>
+                <w:szCs w:val="24"/>
+                <w:lang w:val="es-GT" w:eastAsia="es-GT"/>
+                <w14:ligatures w14:val="standardContextual"/>
+              </w:rPr>
+              <w:tab/>
+            </w:r>
+            <w:r>
+              <w:rPr>
+                <w:rStyle w:val="Hipervnculo"/>
+                <w:noProof/>
+                <w:lang w:val="en-US"/>
+              </w:rPr>
+              <w:t>Configurar servidor de salida SMTP</w:t>
+            </w:r>
+            <w:r>
+              <w:rPr>
+                <w:noProof/>
+                <w:webHidden/>
+              </w:rPr>
+              <w:tab/>
+            </w:r>
+            <w:r>
+              <w:rPr>
+                <w:noProof/>
+                <w:webHidden/>
+              </w:rPr>
+              <w:fldChar w:fldCharType="begin"/>
+            </w:r>
+            <w:r>
+              <w:rPr>
+                <w:noProof/>
+                <w:webHidden/>
+              </w:rPr>
+              <w:instrText xml:space="preserve"> PAGEREF _Toc226654635 \h </w:instrText>
+            </w:r>
+            <w:r>
+              <w:rPr>
+                <w:noProof/>
+                <w:webHidden/>
+              </w:rPr>
+            </w:r>
+            <w:r>
+              <w:rPr>
+                <w:noProof/>
+                <w:webHidden/>
+              </w:rPr>
+              <w:fldChar w:fldCharType="separate"/>
+            </w:r>
+            <w:r>
+              <w:rPr>
+                <w:noProof/>
+                <w:webHidden/>
+              </w:rPr>
+              <w:t>25</w:t>
             </w:r>
             <w:r>
               <w:rPr>
@@ -1420,112 +2266,13 @@
     </w:p>
     <w:p>
       <w:pPr>
-        <w:spacing w:after="160" w:line="259" w:lineRule="auto"/>
-        <w:jc w:val="left"/>
-        <w:rPr>
-          <w:b/>
-          <w:bCs/>
-          <w:noProof/>
-        </w:rPr>
-      </w:pPr>
-    </w:p>
-    <w:p>
-      <w:pPr>
-        <w:spacing w:after="160" w:line="259" w:lineRule="auto"/>
-        <w:jc w:val="left"/>
-        <w:rPr>
-          <w:b/>
-          <w:bCs/>
-          <w:noProof/>
-        </w:rPr>
-      </w:pPr>
-    </w:p>
-    <w:p>
-      <w:pPr>
-        <w:spacing w:after="160" w:line="259" w:lineRule="auto"/>
-        <w:jc w:val="left"/>
-        <w:rPr>
-          <w:b/>
-          <w:bCs/>
-          <w:noProof/>
-        </w:rPr>
-      </w:pPr>
-    </w:p>
-    <w:p>
-      <w:pPr>
-        <w:spacing w:after="160" w:line="259" w:lineRule="auto"/>
-        <w:jc w:val="left"/>
-        <w:rPr>
-          <w:b/>
-          <w:bCs/>
-          <w:noProof/>
-        </w:rPr>
-      </w:pPr>
-    </w:p>
-    <w:p>
-      <w:pPr>
-        <w:spacing w:after="160" w:line="259" w:lineRule="auto"/>
-        <w:jc w:val="left"/>
-        <w:rPr>
-          <w:b/>
-          <w:bCs/>
-          <w:noProof/>
-        </w:rPr>
-      </w:pPr>
-    </w:p>
-    <w:p>
-      <w:pPr>
-        <w:spacing w:after="160" w:line="259" w:lineRule="auto"/>
-        <w:jc w:val="left"/>
-        <w:rPr>
-          <w:b/>
-          <w:bCs/>
-          <w:noProof/>
-        </w:rPr>
-      </w:pPr>
-    </w:p>
-    <w:p>
-      <w:pPr>
-        <w:spacing w:after="160" w:line="259" w:lineRule="auto"/>
-        <w:jc w:val="left"/>
-        <w:rPr>
-          <w:b/>
-          <w:bCs/>
-          <w:noProof/>
-        </w:rPr>
-      </w:pPr>
-    </w:p>
-    <w:p>
-      <w:pPr>
-        <w:spacing w:after="160" w:line="259" w:lineRule="auto"/>
-        <w:jc w:val="left"/>
-        <w:rPr>
-          <w:b/>
-          <w:bCs/>
-          <w:noProof/>
-        </w:rPr>
-      </w:pPr>
-    </w:p>
-    <w:p>
-      <w:pPr>
-        <w:spacing w:after="160" w:line="259" w:lineRule="auto"/>
-        <w:jc w:val="left"/>
-        <w:rPr>
-          <w:b/>
-          <w:bCs/>
-          <w:noProof/>
-        </w:rPr>
-      </w:pPr>
-    </w:p>
-    <w:p>
-      <w:pPr>
-        <w:pStyle w:val="Heading1"/>
-        <w:rPr>
-          <w:lang w:val="es-GT"/>
-        </w:rPr>
-      </w:pPr>
-      <w:bookmarkStart w:id="0" w:name="_Toc225111272"/>
-      <w:bookmarkStart w:id="1" w:name="_Toc226587296"/>
+        <w:pStyle w:val="Ttulo1"/>
+        <w:rPr>
+          <w:lang w:val="es-GT"/>
+        </w:rPr>
+      </w:pPr>
+      <w:bookmarkStart w:id="1" w:name="_Toc225111272"/>
+      <w:bookmarkStart w:id="2" w:name="_Toc226654618"/>
       <w:r>
         <w:rPr>
           <w:lang w:val="es-GT"/>
@@ -1533,18 +2280,18 @@
         <w:lastRenderedPageBreak/>
         <w:t>Manuales de Instalación</w:t>
       </w:r>
-      <w:bookmarkEnd w:id="0"/>
       <w:bookmarkEnd w:id="1"/>
-    </w:p>
-    <w:p>
-      <w:pPr>
-        <w:pStyle w:val="Heading2"/>
-        <w:rPr>
-          <w:lang w:val="es-GT"/>
-        </w:rPr>
-      </w:pPr>
-      <w:bookmarkStart w:id="2" w:name="_Toc225111273"/>
-      <w:bookmarkStart w:id="3" w:name="_Toc226587297"/>
+      <w:bookmarkEnd w:id="2"/>
+    </w:p>
+    <w:p>
+      <w:pPr>
+        <w:pStyle w:val="Ttulo2"/>
+        <w:rPr>
+          <w:lang w:val="es-GT"/>
+        </w:rPr>
+      </w:pPr>
+      <w:bookmarkStart w:id="3" w:name="_Toc225111273"/>
+      <w:bookmarkStart w:id="4" w:name="_Toc226654619"/>
       <w:r>
         <w:rPr>
           <w:lang w:val="es-GT"/>
@@ -1593,12 +2340,12 @@
         </w:rPr>
         <w:t xml:space="preserve"> (vía Docker)</w:t>
       </w:r>
-      <w:bookmarkEnd w:id="2"/>
       <w:bookmarkEnd w:id="3"/>
-    </w:p>
-    <w:p>
-      <w:pPr>
-        <w:pStyle w:val="Heading3"/>
+      <w:bookmarkEnd w:id="4"/>
+    </w:p>
+    <w:p>
+      <w:pPr>
+        <w:pStyle w:val="Ttulo3"/>
         <w:numPr>
           <w:ilvl w:val="0"/>
           <w:numId w:val="25"/>
@@ -1607,20 +2354,20 @@
           <w:lang w:val="es-GT"/>
         </w:rPr>
       </w:pPr>
-      <w:bookmarkStart w:id="4" w:name="_Toc225111274"/>
-      <w:bookmarkStart w:id="5" w:name="_Toc226587298"/>
+      <w:bookmarkStart w:id="5" w:name="_Toc225111274"/>
+      <w:bookmarkStart w:id="6" w:name="_Toc226654620"/>
       <w:r>
         <w:rPr>
           <w:lang w:val="es-GT"/>
         </w:rPr>
         <w:t>Requerimientos del Sistema</w:t>
       </w:r>
-      <w:bookmarkEnd w:id="4"/>
       <w:bookmarkEnd w:id="5"/>
+      <w:bookmarkEnd w:id="6"/>
     </w:p>
     <w:tbl>
       <w:tblPr>
-        <w:tblStyle w:val="TableGrid"/>
+        <w:tblStyle w:val="Tablaconcuadrcula"/>
         <w:tblW w:w="0" w:type="auto"/>
         <w:tblLook w:val="04A0" w:firstRow="1" w:lastRow="0" w:firstColumn="1" w:lastColumn="0" w:noHBand="0" w:noVBand="1"/>
       </w:tblPr>
@@ -1723,6 +2470,12 @@
               </w:rPr>
               <w:t>Ubuntu 22.04 LTS</w:t>
             </w:r>
+            <w:r>
+              <w:rPr>
+                <w:lang w:val="es-GT"/>
+              </w:rPr>
+              <w:t xml:space="preserve"> o similar</w:t>
+            </w:r>
           </w:p>
         </w:tc>
       </w:tr>
@@ -2085,8 +2838,16 @@
               <w:rPr>
                 <w:lang w:val="es-GT"/>
               </w:rPr>
-              <w:t>Requerido para descargar imágenes de Docker Hub</w:t>
-            </w:r>
+              <w:t xml:space="preserve">Requerido para descargar imágenes de Docker </w:t>
+            </w:r>
+            <w:proofErr w:type="gramStart"/>
+            <w:r>
+              <w:rPr>
+                <w:lang w:val="es-GT"/>
+              </w:rPr>
+              <w:t>Hub</w:t>
+            </w:r>
+            <w:proofErr w:type="gramEnd"/>
           </w:p>
         </w:tc>
       </w:tr>
@@ -2237,13 +2998,13 @@
     </w:p>
     <w:p>
       <w:pPr>
-        <w:pStyle w:val="Heading3"/>
-        <w:rPr>
-          <w:lang w:val="es-GT"/>
-        </w:rPr>
-      </w:pPr>
-      <w:bookmarkStart w:id="6" w:name="_Toc225111275"/>
-      <w:bookmarkStart w:id="7" w:name="_Toc226587299"/>
+        <w:pStyle w:val="Ttulo3"/>
+        <w:rPr>
+          <w:lang w:val="es-GT"/>
+        </w:rPr>
+      </w:pPr>
+      <w:bookmarkStart w:id="7" w:name="_Toc225111275"/>
+      <w:bookmarkStart w:id="8" w:name="_Toc226654621"/>
       <w:r>
         <w:rPr>
           <w:lang w:val="es-GT"/>
@@ -2251,8 +3012,8 @@
         <w:lastRenderedPageBreak/>
         <w:t>Procedimiento de Instalación (Ubuntu 22.04 + Docker)</w:t>
       </w:r>
-      <w:bookmarkEnd w:id="6"/>
       <w:bookmarkEnd w:id="7"/>
+      <w:bookmarkEnd w:id="8"/>
     </w:p>
     <w:p>
       <w:pPr>
@@ -3192,7 +3953,25 @@
                                 <w:iCs/>
                                 <w:lang w:val="en-US"/>
                               </w:rPr>
-                              <w:t>"deb [arch=$(</w:t>
+                              <w:t>"</w:t>
+                            </w:r>
+                            <w:proofErr w:type="gramStart"/>
+                            <w:r>
+                              <w:rPr>
+                                <w:i/>
+                                <w:iCs/>
+                                <w:lang w:val="en-US"/>
+                              </w:rPr>
+                              <w:t>deb</w:t>
+                            </w:r>
+                            <w:proofErr w:type="gramEnd"/>
+                            <w:r>
+                              <w:rPr>
+                                <w:i/>
+                                <w:iCs/>
+                                <w:lang w:val="en-US"/>
+                              </w:rPr>
+                              <w:t xml:space="preserve"> [arch=$(</w:t>
                             </w:r>
                             <w:proofErr w:type="spellStart"/>
                             <w:r>
@@ -5147,47 +5926,20 @@
       </w:pPr>
       <w:r>
         <w:rPr>
-          <w:b/>
-          <w:bCs/>
-          <w:lang w:val="es-GT"/>
-        </w:rPr>
-        <w:lastRenderedPageBreak/>
-        <w:t xml:space="preserve">Paso 5: Agregar el usuario actual al grupo </w:t>
-      </w:r>
-      <w:proofErr w:type="spellStart"/>
-      <w:r>
-        <w:rPr>
-          <w:b/>
-          <w:bCs/>
-          <w:lang w:val="es-GT"/>
-        </w:rPr>
-        <w:t>docker</w:t>
-      </w:r>
-      <w:proofErr w:type="spellEnd"/>
-    </w:p>
-    <w:p>
-      <w:pPr>
-        <w:spacing w:line="240" w:lineRule="auto"/>
-        <w:rPr>
-          <w:i/>
-          <w:iCs/>
-        </w:rPr>
-      </w:pPr>
-      <w:r>
-        <w:rPr>
           <w:noProof/>
           <w:lang w:eastAsia="es-ES"/>
         </w:rPr>
+        <w:lastRenderedPageBreak/>
         <mc:AlternateContent>
           <mc:Choice Requires="wps">
             <w:drawing>
-              <wp:anchor distT="45720" distB="45720" distL="114300" distR="114300" simplePos="0" relativeHeight="251670528" behindDoc="0" locked="0" layoutInCell="1" allowOverlap="1" wp14:anchorId="74A2A160" wp14:editId="1E15C4E1">
+              <wp:anchor distT="45720" distB="45720" distL="114300" distR="114300" simplePos="0" relativeHeight="251670528" behindDoc="0" locked="0" layoutInCell="1" allowOverlap="1" wp14:anchorId="74A2A160" wp14:editId="6547DF60">
                 <wp:simplePos x="0" y="0"/>
                 <wp:positionH relativeFrom="margin">
-                  <wp:posOffset>0</wp:posOffset>
+                  <wp:align>left</wp:align>
                 </wp:positionH>
                 <wp:positionV relativeFrom="paragraph">
-                  <wp:posOffset>217805</wp:posOffset>
+                  <wp:posOffset>342472</wp:posOffset>
                 </wp:positionV>
                 <wp:extent cx="5718810" cy="534670"/>
                 <wp:effectExtent l="0" t="0" r="0" b="0"/>
@@ -5205,7 +5957,7 @@
                       <wps:spPr bwMode="auto">
                         <a:xfrm>
                           <a:off x="0" y="0"/>
-                          <a:ext cx="5719313" cy="534670"/>
+                          <a:ext cx="5718810" cy="534670"/>
                         </a:xfrm>
                         <a:prstGeom prst="rect">
                           <a:avLst/>
@@ -5341,7 +6093,11 @@
           </mc:Choice>
           <mc:Fallback>
             <w:pict>
-              <v:shape w14:anchorId="74A2A160" id="_x0000_s1031" type="#_x0000_t202" style="position:absolute;left:0;text-align:left;margin-left:0;margin-top:17.15pt;width:450.3pt;height:42.1pt;z-index:251670528;visibility:visible;mso-wrap-style:square;mso-width-percent:0;mso-height-percent:0;mso-wrap-distance-left:9pt;mso-wrap-distance-top:3.6pt;mso-wrap-distance-right:9pt;mso-wrap-distance-bottom:3.6pt;mso-position-horizontal:absolute;mso-position-horizontal-relative:margin;mso-position-vertical:absolute;mso-position-vertical-relative:text;mso-width-percent:0;mso-height-percent:0;mso-width-relative:margin;mso-height-relative:margin;v-text-anchor:top" o:gfxdata="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" fillcolor="#e7e6e6 [3214]" stroked="f">
+              <v:shapetype w14:anchorId="74A2A160" id="_x0000_t202" coordsize="21600,21600" o:spt="202" path="m,l,21600r21600,l21600,xe">
+                <v:stroke joinstyle="miter"/>
+                <v:path gradientshapeok="t" o:connecttype="rect"/>
+              </v:shapetype>
+              <v:shape id="_x0000_s1031" type="#_x0000_t202" style="position:absolute;left:0;text-align:left;margin-left:0;margin-top:26.95pt;width:450.3pt;height:42.1pt;z-index:251670528;visibility:visible;mso-wrap-style:square;mso-width-percent:0;mso-height-percent:0;mso-wrap-distance-left:9pt;mso-wrap-distance-top:3.6pt;mso-wrap-distance-right:9pt;mso-wrap-distance-bottom:3.6pt;mso-position-horizontal:left;mso-position-horizontal-relative:margin;mso-position-vertical:absolute;mso-position-vertical-relative:text;mso-width-percent:0;mso-height-percent:0;mso-width-relative:margin;mso-height-relative:margin;v-text-anchor:top" o:gfxdata="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" fillcolor="#e7e6e6 [3214]" stroked="f">
                 <v:textbox>
                   <w:txbxContent>
                     <w:p>
@@ -5452,6 +6208,33 @@
           </mc:Fallback>
         </mc:AlternateContent>
       </w:r>
+      <w:r>
+        <w:rPr>
+          <w:b/>
+          <w:bCs/>
+          <w:lang w:val="es-GT"/>
+        </w:rPr>
+        <w:t xml:space="preserve">Paso 5: Agregar el usuario actual al grupo </w:t>
+      </w:r>
+      <w:proofErr w:type="spellStart"/>
+      <w:r>
+        <w:rPr>
+          <w:b/>
+          <w:bCs/>
+          <w:lang w:val="es-GT"/>
+        </w:rPr>
+        <w:t>docker</w:t>
+      </w:r>
+      <w:proofErr w:type="spellEnd"/>
+    </w:p>
+    <w:p>
+      <w:pPr>
+        <w:spacing w:line="240" w:lineRule="auto"/>
+        <w:rPr>
+          <w:i/>
+          <w:iCs/>
+        </w:rPr>
+      </w:pPr>
     </w:p>
     <w:p>
       <w:pPr>
@@ -5918,13 +6701,6 @@
         <w:t>docker-compose.yml</w:t>
       </w:r>
       <w:proofErr w:type="spellEnd"/>
-    </w:p>
-    <w:p>
-      <w:pPr>
-        <w:rPr>
-          <w:lang w:val="es-GT"/>
-        </w:rPr>
-      </w:pPr>
       <w:r>
         <w:rPr>
           <w:noProof/>
@@ -6785,7 +7561,25 @@
                                 <w:iCs/>
                                 <w:lang w:val="en-US"/>
                               </w:rPr>
-                              <w:t xml:space="preserve">      - ./addons:/</w:t>
+                              <w:t xml:space="preserve">      </w:t>
+                            </w:r>
+                            <w:proofErr w:type="gramStart"/>
+                            <w:r>
+                              <w:rPr>
+                                <w:i/>
+                                <w:iCs/>
+                                <w:lang w:val="en-US"/>
+                              </w:rPr>
+                              <w:t>- .</w:t>
+                            </w:r>
+                            <w:proofErr w:type="gramEnd"/>
+                            <w:r>
+                              <w:rPr>
+                                <w:i/>
+                                <w:iCs/>
+                                <w:lang w:val="en-US"/>
+                              </w:rPr>
+                              <w:t>/addons:/</w:t>
                             </w:r>
                             <w:proofErr w:type="spellStart"/>
                             <w:r>
@@ -9422,13 +10216,23 @@
                               <w:t xml:space="preserve">INFO </w:t>
                             </w:r>
                             <w:proofErr w:type="spellStart"/>
+                            <w:proofErr w:type="gramStart"/>
                             <w:r>
                               <w:rPr>
                                 <w:i/>
                                 <w:iCs/>
                                 <w:lang w:val="en-US"/>
                               </w:rPr>
-                              <w:t>odoo.service.server</w:t>
+                              <w:t>odoo.service</w:t>
+                            </w:r>
+                            <w:proofErr w:type="gramEnd"/>
+                            <w:r>
+                              <w:rPr>
+                                <w:i/>
+                                <w:iCs/>
+                                <w:lang w:val="en-US"/>
+                              </w:rPr>
+                              <w:t>.server</w:t>
                             </w:r>
                             <w:proofErr w:type="spellEnd"/>
                             <w:r>
@@ -9734,13 +10538,13 @@
     </w:p>
     <w:p>
       <w:pPr>
-        <w:pStyle w:val="Heading3"/>
-        <w:rPr>
-          <w:lang w:val="es-GT"/>
-        </w:rPr>
-      </w:pPr>
-      <w:bookmarkStart w:id="8" w:name="_Toc225111276"/>
-      <w:bookmarkStart w:id="9" w:name="_Toc226587300"/>
+        <w:pStyle w:val="Ttulo3"/>
+        <w:rPr>
+          <w:lang w:val="es-GT"/>
+        </w:rPr>
+      </w:pPr>
+      <w:bookmarkStart w:id="9" w:name="_Toc225111276"/>
+      <w:bookmarkStart w:id="10" w:name="_Toc226654622"/>
       <w:r>
         <w:rPr>
           <w:lang w:val="es-GT"/>
@@ -9748,8 +10552,8 @@
         <w:lastRenderedPageBreak/>
         <w:t>Validación Final del ERP</w:t>
       </w:r>
-      <w:bookmarkEnd w:id="8"/>
       <w:bookmarkEnd w:id="9"/>
+      <w:bookmarkEnd w:id="10"/>
     </w:p>
     <w:p>
       <w:pPr>
@@ -9778,15 +10582,16 @@
           <w:iCs/>
           <w:lang w:val="es-GT"/>
         </w:rPr>
-        <w:t>http://</w:t>
-      </w:r>
+        <w:t>http:/</w:t>
+      </w:r>
+      <w:proofErr w:type="gramStart"/>
       <w:r>
         <w:rPr>
           <w:i/>
           <w:iCs/>
           <w:lang w:val="es-GT"/>
         </w:rPr>
-        <w:t>{direccion IP}</w:t>
+        <w:t>/</w:t>
       </w:r>
       <w:r>
         <w:rPr>
@@ -9794,6 +10599,23 @@
           <w:iCs/>
           <w:lang w:val="es-GT"/>
         </w:rPr>
+        <w:t>{</w:t>
+      </w:r>
+      <w:proofErr w:type="gramEnd"/>
+      <w:r>
+        <w:rPr>
+          <w:i/>
+          <w:iCs/>
+          <w:lang w:val="es-GT"/>
+        </w:rPr>
+        <w:t>direccion IP}</w:t>
+      </w:r>
+      <w:r>
+        <w:rPr>
+          <w:i/>
+          <w:iCs/>
+          <w:lang w:val="es-GT"/>
+        </w:rPr>
         <w:t>:8069</w:t>
       </w:r>
     </w:p>
@@ -9812,7 +10634,7 @@
     </w:p>
     <w:tbl>
       <w:tblPr>
-        <w:tblStyle w:val="TableGrid"/>
+        <w:tblStyle w:val="Tablaconcuadrcula"/>
         <w:tblW w:w="0" w:type="auto"/>
         <w:tblLook w:val="04A0" w:firstRow="1" w:lastRow="0" w:firstColumn="1" w:lastColumn="0" w:noHBand="0" w:noVBand="1"/>
       </w:tblPr>
@@ -10198,13 +11020,13 @@
     </w:p>
     <w:p>
       <w:pPr>
-        <w:pStyle w:val="Heading2"/>
-        <w:rPr>
-          <w:lang w:val="es-GT"/>
-        </w:rPr>
-      </w:pPr>
-      <w:bookmarkStart w:id="10" w:name="_Toc225111277"/>
-      <w:bookmarkStart w:id="11" w:name="_Toc226587301"/>
+        <w:pStyle w:val="Ttulo2"/>
+        <w:rPr>
+          <w:lang w:val="es-GT"/>
+        </w:rPr>
+      </w:pPr>
+      <w:bookmarkStart w:id="11" w:name="_Toc225111277"/>
+      <w:bookmarkStart w:id="12" w:name="_Toc226654623"/>
       <w:r>
         <w:rPr>
           <w:lang w:val="es-GT"/>
@@ -10226,12 +11048,12 @@
         </w:rPr>
         <w:t xml:space="preserve"> CRM (Módulo Integrado)</w:t>
       </w:r>
-      <w:bookmarkEnd w:id="10"/>
       <w:bookmarkEnd w:id="11"/>
-    </w:p>
-    <w:p>
-      <w:pPr>
-        <w:pStyle w:val="Heading3"/>
+      <w:bookmarkEnd w:id="12"/>
+    </w:p>
+    <w:p>
+      <w:pPr>
+        <w:pStyle w:val="Ttulo3"/>
         <w:numPr>
           <w:ilvl w:val="0"/>
           <w:numId w:val="23"/>
@@ -10240,16 +11062,16 @@
           <w:lang w:val="es-GT"/>
         </w:rPr>
       </w:pPr>
-      <w:bookmarkStart w:id="12" w:name="_Toc225111278"/>
-      <w:bookmarkStart w:id="13" w:name="_Toc226587302"/>
+      <w:bookmarkStart w:id="13" w:name="_Toc225111278"/>
+      <w:bookmarkStart w:id="14" w:name="_Toc226654624"/>
       <w:r>
         <w:rPr>
           <w:lang w:val="es-GT"/>
         </w:rPr>
         <w:t>Requerimientos</w:t>
       </w:r>
-      <w:bookmarkEnd w:id="12"/>
       <w:bookmarkEnd w:id="13"/>
+      <w:bookmarkEnd w:id="14"/>
     </w:p>
     <w:p>
       <w:pPr>
@@ -10277,16 +11099,14 @@
         </w:rPr>
         <w:br/>
       </w:r>
-      <w:proofErr w:type="spellStart"/>
       <w:r>
         <w:rPr>
           <w:b/>
           <w:bCs/>
           <w:lang w:val="es-GT"/>
         </w:rPr>
-        <w:t>Prerequisito</w:t>
-      </w:r>
-      <w:proofErr w:type="spellEnd"/>
+        <w:t>Prerrequisito</w:t>
+      </w:r>
       <w:r>
         <w:rPr>
           <w:b/>
@@ -10353,21 +11173,21 @@
     </w:p>
     <w:p>
       <w:pPr>
-        <w:pStyle w:val="Heading3"/>
-        <w:rPr>
-          <w:lang w:val="es-GT"/>
-        </w:rPr>
-      </w:pPr>
-      <w:bookmarkStart w:id="14" w:name="_Toc225111279"/>
-      <w:bookmarkStart w:id="15" w:name="_Toc226587303"/>
+        <w:pStyle w:val="Ttulo3"/>
+        <w:rPr>
+          <w:lang w:val="es-GT"/>
+        </w:rPr>
+      </w:pPr>
+      <w:bookmarkStart w:id="15" w:name="_Toc225111279"/>
+      <w:bookmarkStart w:id="16" w:name="_Toc226654625"/>
       <w:r>
         <w:rPr>
           <w:lang w:val="es-GT"/>
         </w:rPr>
         <w:t>Procedimiento de Activación</w:t>
       </w:r>
-      <w:bookmarkEnd w:id="14"/>
       <w:bookmarkEnd w:id="15"/>
+      <w:bookmarkEnd w:id="16"/>
     </w:p>
     <w:p>
       <w:pPr>
@@ -10817,13 +11637,13 @@
     </w:p>
     <w:p>
       <w:pPr>
-        <w:pStyle w:val="Heading3"/>
-        <w:rPr>
-          <w:lang w:val="es-GT"/>
-        </w:rPr>
-      </w:pPr>
-      <w:bookmarkStart w:id="16" w:name="_Toc225111280"/>
-      <w:bookmarkStart w:id="17" w:name="_Toc226587304"/>
+        <w:pStyle w:val="Ttulo3"/>
+        <w:rPr>
+          <w:lang w:val="es-GT"/>
+        </w:rPr>
+      </w:pPr>
+      <w:bookmarkStart w:id="17" w:name="_Toc225111280"/>
+      <w:bookmarkStart w:id="18" w:name="_Toc226654626"/>
       <w:r>
         <w:rPr>
           <w:lang w:val="es-GT"/>
@@ -10831,8 +11651,8 @@
         <w:lastRenderedPageBreak/>
         <w:t>Validación Final del CRM</w:t>
       </w:r>
-      <w:bookmarkEnd w:id="16"/>
       <w:bookmarkEnd w:id="17"/>
+      <w:bookmarkEnd w:id="18"/>
     </w:p>
     <w:p>
       <w:pPr>
@@ -11100,7 +11920,7 @@
     </w:p>
     <w:p>
       <w:pPr>
-        <w:pStyle w:val="Heading1"/>
+        <w:pStyle w:val="Ttulo1"/>
         <w:numPr>
           <w:ilvl w:val="0"/>
           <w:numId w:val="0"/>
@@ -11110,19 +11930,25 @@
     </w:p>
     <w:p>
       <w:pPr>
-        <w:pStyle w:val="Heading2"/>
+        <w:pStyle w:val="Ttulo2"/>
         <w:jc w:val="center"/>
       </w:pPr>
-      <w:bookmarkStart w:id="18" w:name="_Toc226587305"/>
+      <w:bookmarkStart w:id="19" w:name="_Toc226654627"/>
       <w:r>
         <w:lastRenderedPageBreak/>
-        <w:t xml:space="preserve">Bienvenido a </w:t>
+        <w:t>Bienvenid</w:t>
+      </w:r>
+      <w:r>
+        <w:t>a</w:t>
+      </w:r>
+      <w:r>
+        <w:t xml:space="preserve"> a </w:t>
       </w:r>
       <w:proofErr w:type="spellStart"/>
       <w:r>
         <w:t>Odoo</w:t>
       </w:r>
-      <w:bookmarkEnd w:id="18"/>
+      <w:bookmarkEnd w:id="19"/>
       <w:proofErr w:type="spellEnd"/>
     </w:p>
     <w:p>
@@ -11140,7 +11966,7 @@
     </w:p>
     <w:p>
       <w:pPr>
-        <w:pStyle w:val="ListParagraph"/>
+        <w:pStyle w:val="Prrafodelista"/>
         <w:numPr>
           <w:ilvl w:val="0"/>
           <w:numId w:val="44"/>
@@ -11158,7 +11984,7 @@
     </w:p>
     <w:p>
       <w:pPr>
-        <w:pStyle w:val="ListParagraph"/>
+        <w:pStyle w:val="Prrafodelista"/>
         <w:numPr>
           <w:ilvl w:val="0"/>
           <w:numId w:val="44"/>
@@ -11176,7 +12002,7 @@
     </w:p>
     <w:p>
       <w:pPr>
-        <w:pStyle w:val="ListParagraph"/>
+        <w:pStyle w:val="Prrafodelista"/>
         <w:numPr>
           <w:ilvl w:val="0"/>
           <w:numId w:val="44"/>
@@ -11194,7 +12020,7 @@
     </w:p>
     <w:p>
       <w:pPr>
-        <w:pStyle w:val="ListParagraph"/>
+        <w:pStyle w:val="Prrafodelista"/>
         <w:numPr>
           <w:ilvl w:val="0"/>
           <w:numId w:val="44"/>
@@ -11212,7 +12038,7 @@
     </w:p>
     <w:p>
       <w:pPr>
-        <w:pStyle w:val="ListParagraph"/>
+        <w:pStyle w:val="Prrafodelista"/>
         <w:numPr>
           <w:ilvl w:val="0"/>
           <w:numId w:val="44"/>
@@ -11286,18 +12112,23 @@
     </w:p>
     <w:p>
       <w:pPr>
-        <w:rPr>
-          <w:lang w:val="es-GT"/>
-        </w:rPr>
-      </w:pPr>
-      <w:r>
-        <w:rPr>
-          <w:b/>
-          <w:bCs/>
+        <w:pStyle w:val="Ttulo3"/>
+        <w:numPr>
+          <w:ilvl w:val="0"/>
+          <w:numId w:val="52"/>
+        </w:numPr>
+        <w:rPr>
+          <w:lang w:val="es-GT"/>
+        </w:rPr>
+      </w:pPr>
+      <w:bookmarkStart w:id="20" w:name="_Toc226654628"/>
+      <w:r>
+        <w:rPr>
           <w:lang w:val="es-GT"/>
         </w:rPr>
         <w:t>Carga masiva de Productos</w:t>
       </w:r>
+      <w:bookmarkEnd w:id="20"/>
     </w:p>
     <w:p>
       <w:pPr>
@@ -11325,13 +12156,6 @@
         </w:rPr>
         <w:t>.</w:t>
       </w:r>
-    </w:p>
-    <w:p>
-      <w:pPr>
-        <w:rPr>
-          <w:lang w:val="es-GT"/>
-        </w:rPr>
-      </w:pPr>
     </w:p>
     <w:p>
       <w:pPr>
@@ -11406,6 +12230,11 @@
     </w:p>
     <w:p>
       <w:pPr>
+        <w:jc w:val="center"/>
+      </w:pPr>
+    </w:p>
+    <w:p>
+      <w:pPr>
         <w:jc w:val="left"/>
         <w:rPr>
           <w:lang w:val="es-GT"/>
@@ -11514,21 +12343,7 @@
         <w:rPr>
           <w:lang w:val="es-GT"/>
         </w:rPr>
-        <w:t xml:space="preserve"> </w:t>
-      </w:r>
-      <w:proofErr w:type="spellStart"/>
-      <w:r>
-        <w:rPr>
-          <w:lang w:val="es-GT"/>
-        </w:rPr>
-        <w:t>records</w:t>
-      </w:r>
-      <w:proofErr w:type="spellEnd"/>
-      <w:r>
-        <w:rPr>
-          <w:lang w:val="es-GT"/>
-        </w:rPr>
-        <w:t>.</w:t>
+        <w:t xml:space="preserve"> records.</w:t>
       </w:r>
     </w:p>
     <w:p>
@@ -11601,102 +12416,6 @@
     </w:p>
     <w:p>
       <w:pPr>
-        <w:jc w:val="center"/>
-        <w:rPr>
-          <w:noProof/>
-        </w:rPr>
-      </w:pPr>
-    </w:p>
-    <w:p>
-      <w:pPr>
-        <w:jc w:val="center"/>
-        <w:rPr>
-          <w:noProof/>
-        </w:rPr>
-      </w:pPr>
-    </w:p>
-    <w:p>
-      <w:pPr>
-        <w:jc w:val="center"/>
-        <w:rPr>
-          <w:noProof/>
-        </w:rPr>
-      </w:pPr>
-    </w:p>
-    <w:p>
-      <w:pPr>
-        <w:jc w:val="center"/>
-        <w:rPr>
-          <w:noProof/>
-        </w:rPr>
-      </w:pPr>
-    </w:p>
-    <w:p>
-      <w:pPr>
-        <w:jc w:val="center"/>
-        <w:rPr>
-          <w:noProof/>
-        </w:rPr>
-      </w:pPr>
-    </w:p>
-    <w:p>
-      <w:pPr>
-        <w:jc w:val="center"/>
-        <w:rPr>
-          <w:noProof/>
-        </w:rPr>
-      </w:pPr>
-    </w:p>
-    <w:p>
-      <w:pPr>
-        <w:jc w:val="center"/>
-        <w:rPr>
-          <w:noProof/>
-        </w:rPr>
-      </w:pPr>
-    </w:p>
-    <w:p>
-      <w:pPr>
-        <w:jc w:val="center"/>
-        <w:rPr>
-          <w:noProof/>
-        </w:rPr>
-      </w:pPr>
-    </w:p>
-    <w:p>
-      <w:pPr>
-        <w:jc w:val="center"/>
-        <w:rPr>
-          <w:noProof/>
-        </w:rPr>
-      </w:pPr>
-    </w:p>
-    <w:p>
-      <w:pPr>
-        <w:jc w:val="center"/>
-        <w:rPr>
-          <w:noProof/>
-        </w:rPr>
-      </w:pPr>
-    </w:p>
-    <w:p>
-      <w:pPr>
-        <w:jc w:val="center"/>
-        <w:rPr>
-          <w:noProof/>
-        </w:rPr>
-      </w:pPr>
-    </w:p>
-    <w:p>
-      <w:pPr>
-        <w:jc w:val="center"/>
-        <w:rPr>
-          <w:noProof/>
-        </w:rPr>
-      </w:pPr>
-    </w:p>
-    <w:p>
-      <w:pPr>
         <w:jc w:val="left"/>
         <w:rPr>
           <w:noProof/>
@@ -11708,17 +12427,8 @@
           <w:noProof/>
           <w:lang w:val="en-US"/>
         </w:rPr>
-        <w:lastRenderedPageBreak/>
         <w:t>Y presionamos Upload File.</w:t>
       </w:r>
-    </w:p>
-    <w:p>
-      <w:pPr>
-        <w:jc w:val="center"/>
-        <w:rPr>
-          <w:noProof/>
-        </w:rPr>
-      </w:pPr>
     </w:p>
     <w:p>
       <w:pPr>
@@ -11778,6 +12488,11 @@
     </w:p>
     <w:p>
       <w:pPr>
+        <w:jc w:val="center"/>
+      </w:pPr>
+    </w:p>
+    <w:p>
+      <w:pPr>
         <w:jc w:val="left"/>
         <w:rPr>
           <w:lang w:val="es-GT"/>
@@ -11787,6 +12502,7 @@
         <w:rPr>
           <w:lang w:val="es-GT"/>
         </w:rPr>
+        <w:lastRenderedPageBreak/>
         <w:t xml:space="preserve">Luego solo mapeamos los campos correctamente y presionamos </w:t>
       </w:r>
       <w:proofErr w:type="spellStart"/>
@@ -11866,114 +12582,24 @@
     </w:p>
     <w:p>
       <w:pPr>
-        <w:jc w:val="center"/>
-        <w:rPr>
-          <w:lang w:val="es-GT"/>
-        </w:rPr>
-      </w:pPr>
-    </w:p>
-    <w:p>
-      <w:pPr>
-        <w:jc w:val="center"/>
-        <w:rPr>
-          <w:lang w:val="es-GT"/>
-        </w:rPr>
-      </w:pPr>
-    </w:p>
-    <w:p>
-      <w:pPr>
-        <w:jc w:val="center"/>
-        <w:rPr>
-          <w:lang w:val="es-GT"/>
-        </w:rPr>
-      </w:pPr>
-    </w:p>
-    <w:p>
-      <w:pPr>
-        <w:jc w:val="center"/>
-        <w:rPr>
-          <w:lang w:val="es-GT"/>
-        </w:rPr>
-      </w:pPr>
-    </w:p>
-    <w:p>
-      <w:pPr>
-        <w:jc w:val="center"/>
-        <w:rPr>
-          <w:lang w:val="es-GT"/>
-        </w:rPr>
-      </w:pPr>
-    </w:p>
-    <w:p>
-      <w:pPr>
-        <w:jc w:val="center"/>
-        <w:rPr>
-          <w:lang w:val="es-GT"/>
-        </w:rPr>
-      </w:pPr>
-    </w:p>
-    <w:p>
-      <w:pPr>
-        <w:jc w:val="center"/>
-        <w:rPr>
-          <w:lang w:val="es-GT"/>
-        </w:rPr>
-      </w:pPr>
-    </w:p>
-    <w:p>
-      <w:pPr>
-        <w:jc w:val="center"/>
-        <w:rPr>
-          <w:lang w:val="es-GT"/>
-        </w:rPr>
-      </w:pPr>
-    </w:p>
-    <w:p>
-      <w:pPr>
-        <w:jc w:val="center"/>
-        <w:rPr>
-          <w:lang w:val="es-GT"/>
-        </w:rPr>
-      </w:pPr>
-    </w:p>
-    <w:p>
-      <w:pPr>
-        <w:jc w:val="center"/>
-        <w:rPr>
-          <w:lang w:val="es-GT"/>
-        </w:rPr>
-      </w:pPr>
-    </w:p>
-    <w:p>
-      <w:pPr>
-        <w:jc w:val="center"/>
-        <w:rPr>
-          <w:lang w:val="es-GT"/>
-        </w:rPr>
-      </w:pPr>
-    </w:p>
-    <w:p>
-      <w:pPr>
-        <w:rPr>
-          <w:lang w:val="es-GT"/>
-        </w:rPr>
-      </w:pPr>
-    </w:p>
-    <w:p>
-      <w:pPr>
-        <w:rPr>
-          <w:lang w:val="es-GT"/>
-        </w:rPr>
-      </w:pPr>
-      <w:r>
-        <w:rPr>
-          <w:lang w:val="es-GT"/>
-        </w:rPr>
-        <w:lastRenderedPageBreak/>
+        <w:rPr>
+          <w:lang w:val="es-GT"/>
+        </w:rPr>
+      </w:pPr>
+    </w:p>
+    <w:p>
+      <w:pPr>
+        <w:rPr>
+          <w:lang w:val="es-GT"/>
+        </w:rPr>
+      </w:pPr>
+      <w:r>
+        <w:rPr>
+          <w:lang w:val="es-GT"/>
+        </w:rPr>
         <w:t>Verificamos que los productos se carguen correctamente.</w:t>
       </w:r>
     </w:p>
-    <w:p/>
     <w:p>
       <w:pPr>
         <w:jc w:val="center"/>
@@ -12032,6 +12658,22 @@
     </w:p>
     <w:p>
       <w:pPr>
+        <w:pStyle w:val="Ttulo3"/>
+        <w:rPr>
+          <w:lang w:val="es-GT"/>
+        </w:rPr>
+      </w:pPr>
+      <w:bookmarkStart w:id="21" w:name="_Toc226654629"/>
+      <w:r>
+        <w:rPr>
+          <w:lang w:val="es-GT"/>
+        </w:rPr>
+        <w:t>Carga masiva de Clientes y Proveedores</w:t>
+      </w:r>
+      <w:bookmarkEnd w:id="21"/>
+    </w:p>
+    <w:p>
+      <w:pPr>
         <w:jc w:val="left"/>
         <w:rPr>
           <w:lang w:val="es-GT"/>
@@ -12039,22 +12681,6 @@
       </w:pPr>
       <w:r>
         <w:rPr>
-          <w:b/>
-          <w:bCs/>
-          <w:lang w:val="es-GT"/>
-        </w:rPr>
-        <w:t>Carga masiva de Clientes y Proveedores</w:t>
-      </w:r>
-    </w:p>
-    <w:p>
-      <w:pPr>
-        <w:jc w:val="left"/>
-        <w:rPr>
-          <w:lang w:val="es-GT"/>
-        </w:rPr>
-      </w:pPr>
-      <w:r>
-        <w:rPr>
           <w:lang w:val="es-GT"/>
         </w:rPr>
         <w:t xml:space="preserve">Seleccionamos el módulo de </w:t>
@@ -12073,11 +12699,6 @@
         </w:rPr>
         <w:t>.</w:t>
       </w:r>
-    </w:p>
-    <w:p>
-      <w:pPr>
-        <w:jc w:val="center"/>
-      </w:pPr>
     </w:p>
     <w:p>
       <w:pPr>
@@ -12130,56 +12751,7 @@
         </w:drawing>
       </w:r>
     </w:p>
-    <w:p>
-      <w:pPr>
-        <w:jc w:val="center"/>
-      </w:pPr>
-    </w:p>
-    <w:p>
-      <w:pPr>
-        <w:jc w:val="center"/>
-      </w:pPr>
-    </w:p>
-    <w:p>
-      <w:pPr>
-        <w:jc w:val="center"/>
-      </w:pPr>
-    </w:p>
-    <w:p>
-      <w:pPr>
-        <w:jc w:val="center"/>
-      </w:pPr>
-    </w:p>
-    <w:p>
-      <w:pPr>
-        <w:jc w:val="center"/>
-      </w:pPr>
-    </w:p>
-    <w:p>
-      <w:pPr>
-        <w:jc w:val="center"/>
-      </w:pPr>
-    </w:p>
-    <w:p>
-      <w:pPr>
-        <w:jc w:val="center"/>
-      </w:pPr>
-    </w:p>
-    <w:p>
-      <w:pPr>
-        <w:jc w:val="center"/>
-      </w:pPr>
-    </w:p>
-    <w:p>
-      <w:pPr>
-        <w:jc w:val="center"/>
-      </w:pPr>
-    </w:p>
-    <w:p>
-      <w:pPr>
-        <w:jc w:val="center"/>
-      </w:pPr>
-    </w:p>
+    <w:p/>
     <w:p>
       <w:pPr>
         <w:jc w:val="left"/>
@@ -12194,14 +12766,6 @@
         <w:lastRenderedPageBreak/>
         <w:t>Y repetimos el mismo proceso que con los productos.</w:t>
       </w:r>
-    </w:p>
-    <w:p>
-      <w:pPr>
-        <w:jc w:val="center"/>
-        <w:rPr>
-          <w:lang w:val="es-GT"/>
-        </w:rPr>
-      </w:pPr>
     </w:p>
     <w:p>
       <w:pPr>
@@ -12256,6 +12820,11 @@
     </w:p>
     <w:p>
       <w:pPr>
+        <w:jc w:val="center"/>
+      </w:pPr>
+    </w:p>
+    <w:p>
+      <w:pPr>
         <w:jc w:val="left"/>
         <w:rPr>
           <w:lang w:val="es-GT"/>
@@ -12267,14 +12836,6 @@
         </w:rPr>
         <w:t>Debemos subir los archivos CSV de clientes y proveedores.</w:t>
       </w:r>
-    </w:p>
-    <w:p>
-      <w:pPr>
-        <w:jc w:val="center"/>
-        <w:rPr>
-          <w:lang w:val="es-GT"/>
-        </w:rPr>
-      </w:pPr>
     </w:p>
     <w:p>
       <w:pPr>
@@ -12351,13 +12912,6 @@
     </w:p>
     <w:p>
       <w:pPr>
-        <w:rPr>
-          <w:lang w:val="es-GT"/>
-        </w:rPr>
-      </w:pPr>
-    </w:p>
-    <w:p>
-      <w:pPr>
         <w:jc w:val="center"/>
       </w:pPr>
       <w:r>
@@ -12414,6 +12968,22 @@
           <w:lang w:val="es-GT"/>
         </w:rPr>
       </w:pPr>
+    </w:p>
+    <w:p>
+      <w:pPr>
+        <w:jc w:val="left"/>
+        <w:rPr>
+          <w:lang w:val="es-GT"/>
+        </w:rPr>
+      </w:pPr>
+    </w:p>
+    <w:p>
+      <w:pPr>
+        <w:jc w:val="left"/>
+        <w:rPr>
+          <w:lang w:val="es-GT"/>
+        </w:rPr>
+      </w:pPr>
       <w:r>
         <w:rPr>
           <w:lang w:val="es-GT"/>
@@ -12421,14 +12991,6 @@
         <w:lastRenderedPageBreak/>
         <w:t>Verificamos que ambos archivos se hayan cargado correctamente.</w:t>
       </w:r>
-    </w:p>
-    <w:p>
-      <w:pPr>
-        <w:jc w:val="center"/>
-        <w:rPr>
-          <w:lang w:val="es-GT"/>
-        </w:rPr>
-      </w:pPr>
     </w:p>
     <w:p>
       <w:pPr>
@@ -12484,34 +13046,49 @@
     <w:p>
       <w:pPr>
         <w:jc w:val="left"/>
-      </w:pPr>
-      <w:r>
         <w:rPr>
           <w:b/>
           <w:bCs/>
           <w:lang w:val="es-GT"/>
         </w:rPr>
+      </w:pPr>
+    </w:p>
+    <w:p>
+      <w:pPr>
+        <w:pStyle w:val="Ttulo2"/>
+      </w:pPr>
+      <w:bookmarkStart w:id="22" w:name="_Toc226654630"/>
+      <w:r>
+        <w:rPr>
+          <w:lang w:val="es-GT"/>
+        </w:rPr>
         <w:t>CRM y ERP</w:t>
       </w:r>
-    </w:p>
-    <w:p>
-      <w:pPr>
-        <w:rPr>
-          <w:lang w:val="es-GT"/>
-        </w:rPr>
-      </w:pPr>
-      <w:r>
-        <w:rPr>
-          <w:b/>
-          <w:bCs/>
+      <w:bookmarkEnd w:id="22"/>
+    </w:p>
+    <w:p>
+      <w:pPr>
+        <w:pStyle w:val="Ttulo3"/>
+        <w:numPr>
+          <w:ilvl w:val="0"/>
+          <w:numId w:val="53"/>
+        </w:numPr>
+        <w:rPr>
+          <w:lang w:val="es-GT"/>
+        </w:rPr>
+      </w:pPr>
+      <w:bookmarkStart w:id="23" w:name="_Toc226654631"/>
+      <w:r>
+        <w:rPr>
           <w:lang w:val="es-GT"/>
         </w:rPr>
         <w:t>ERP (ventas, compras, inventario)</w:t>
       </w:r>
-    </w:p>
-    <w:p>
-      <w:pPr>
-        <w:pStyle w:val="ListParagraph"/>
+      <w:bookmarkEnd w:id="23"/>
+    </w:p>
+    <w:p>
+      <w:pPr>
+        <w:pStyle w:val="Prrafodelista"/>
         <w:numPr>
           <w:ilvl w:val="0"/>
           <w:numId w:val="46"/>
@@ -12579,7 +13156,7 @@
     </w:p>
     <w:p>
       <w:pPr>
-        <w:pStyle w:val="ListParagraph"/>
+        <w:pStyle w:val="Prrafodelista"/>
         <w:numPr>
           <w:ilvl w:val="0"/>
           <w:numId w:val="46"/>
@@ -12625,7 +13202,7 @@
     </w:p>
     <w:p>
       <w:pPr>
-        <w:pStyle w:val="ListParagraph"/>
+        <w:pStyle w:val="Prrafodelista"/>
         <w:numPr>
           <w:ilvl w:val="0"/>
           <w:numId w:val="46"/>
@@ -12773,23 +13350,23 @@
     </w:p>
     <w:p>
       <w:pPr>
-        <w:rPr>
-          <w:lang w:val="es-GT"/>
-        </w:rPr>
-      </w:pPr>
-      <w:r>
-        <w:rPr>
-          <w:b/>
-          <w:bCs/>
-          <w:lang w:val="es-GT"/>
-        </w:rPr>
-        <w:lastRenderedPageBreak/>
+        <w:pStyle w:val="Ttulo3"/>
+        <w:rPr>
+          <w:lang w:val="es-GT"/>
+        </w:rPr>
+      </w:pPr>
+      <w:bookmarkStart w:id="24" w:name="_Toc226654632"/>
+      <w:r>
+        <w:rPr>
+          <w:lang w:val="es-GT"/>
+        </w:rPr>
         <w:t>CRM</w:t>
       </w:r>
-    </w:p>
-    <w:p>
-      <w:pPr>
-        <w:pStyle w:val="ListParagraph"/>
+      <w:bookmarkEnd w:id="24"/>
+    </w:p>
+    <w:p>
+      <w:pPr>
+        <w:pStyle w:val="Prrafodelista"/>
         <w:numPr>
           <w:ilvl w:val="0"/>
           <w:numId w:val="45"/>
@@ -12821,7 +13398,7 @@
     </w:p>
     <w:p>
       <w:pPr>
-        <w:pStyle w:val="ListParagraph"/>
+        <w:pStyle w:val="Prrafodelista"/>
         <w:numPr>
           <w:ilvl w:val="0"/>
           <w:numId w:val="45"/>
@@ -12926,15 +13503,20 @@
     </w:p>
     <w:p>
       <w:pPr>
+        <w:jc w:val="center"/>
+      </w:pPr>
+    </w:p>
+    <w:p>
+      <w:pPr>
+        <w:pStyle w:val="Ttulo3"/>
         <w:rPr>
           <w:lang w:val="en-US"/>
         </w:rPr>
       </w:pPr>
+      <w:bookmarkStart w:id="25" w:name="_Toc226654633"/>
       <w:proofErr w:type="spellStart"/>
       <w:r>
         <w:rPr>
-          <w:b/>
-          <w:bCs/>
           <w:lang w:val="en-US"/>
         </w:rPr>
         <w:t>Compras</w:t>
@@ -12942,8 +13524,6 @@
       <w:proofErr w:type="spellEnd"/>
       <w:r>
         <w:rPr>
-          <w:b/>
-          <w:bCs/>
           <w:lang w:val="en-US"/>
         </w:rPr>
         <w:t xml:space="preserve"> a </w:t>
@@ -12951,25 +13531,16 @@
       <w:proofErr w:type="spellStart"/>
       <w:r>
         <w:rPr>
-          <w:b/>
-          <w:bCs/>
           <w:lang w:val="en-US"/>
         </w:rPr>
         <w:t>proveedores</w:t>
       </w:r>
+      <w:bookmarkEnd w:id="25"/>
       <w:proofErr w:type="spellEnd"/>
     </w:p>
     <w:p>
       <w:pPr>
-        <w:jc w:val="center"/>
-        <w:rPr>
-          <w:lang w:val="en-US"/>
-        </w:rPr>
-      </w:pPr>
-    </w:p>
-    <w:p>
-      <w:pPr>
-        <w:pStyle w:val="ListParagraph"/>
+        <w:pStyle w:val="Prrafodelista"/>
         <w:numPr>
           <w:ilvl w:val="0"/>
           <w:numId w:val="47"/>
@@ -12978,16 +13549,24 @@
           <w:lang w:val="en-US"/>
         </w:rPr>
       </w:pPr>
+      <w:proofErr w:type="gramStart"/>
       <w:r>
         <w:rPr>
           <w:lang w:val="en-US"/>
         </w:rPr>
-        <w:t>Ve a Purchase → Orders → Purchase Orders → New</w:t>
-      </w:r>
-    </w:p>
-    <w:p>
-      <w:pPr>
-        <w:pStyle w:val="ListParagraph"/>
+        <w:t>Ve a Purchase → Orders →</w:t>
+      </w:r>
+      <w:proofErr w:type="gramEnd"/>
+      <w:r>
+        <w:rPr>
+          <w:lang w:val="en-US"/>
+        </w:rPr>
+        <w:t xml:space="preserve"> Purchase Orders → New</w:t>
+      </w:r>
+    </w:p>
+    <w:p>
+      <w:pPr>
+        <w:pStyle w:val="Prrafodelista"/>
         <w:numPr>
           <w:ilvl w:val="0"/>
           <w:numId w:val="47"/>
@@ -13005,7 +13584,7 @@
     </w:p>
     <w:p>
       <w:pPr>
-        <w:pStyle w:val="ListParagraph"/>
+        <w:pStyle w:val="Prrafodelista"/>
         <w:numPr>
           <w:ilvl w:val="0"/>
           <w:numId w:val="47"/>
@@ -13037,7 +13616,7 @@
     </w:p>
     <w:p>
       <w:pPr>
-        <w:pStyle w:val="ListParagraph"/>
+        <w:pStyle w:val="Prrafodelista"/>
         <w:numPr>
           <w:ilvl w:val="0"/>
           <w:numId w:val="47"/>
@@ -13083,7 +13662,7 @@
     </w:p>
     <w:p>
       <w:pPr>
-        <w:pStyle w:val="ListParagraph"/>
+        <w:pStyle w:val="Prrafodelista"/>
         <w:numPr>
           <w:ilvl w:val="0"/>
           <w:numId w:val="47"/>
@@ -13129,7 +13708,7 @@
     </w:p>
     <w:p>
       <w:pPr>
-        <w:pStyle w:val="ListParagraph"/>
+        <w:pStyle w:val="Prrafodelista"/>
         <w:numPr>
           <w:ilvl w:val="0"/>
           <w:numId w:val="47"/>
@@ -13387,31 +13966,30 @@
     </w:p>
     <w:p>
       <w:pPr>
-        <w:rPr>
-          <w:lang w:val="es-GT"/>
-        </w:rPr>
-      </w:pPr>
-      <w:r>
-        <w:rPr>
-          <w:b/>
-          <w:bCs/>
+        <w:pStyle w:val="Ttulo3"/>
+        <w:rPr>
+          <w:lang w:val="es-GT"/>
+        </w:rPr>
+      </w:pPr>
+      <w:bookmarkStart w:id="26" w:name="_Toc226654634"/>
+      <w:r>
+        <w:rPr>
           <w:lang w:val="es-GT"/>
         </w:rPr>
         <w:lastRenderedPageBreak/>
-        <w:t xml:space="preserve">Cotizaciones de Productos </w:t>
-      </w:r>
-    </w:p>
-    <w:p>
-      <w:pPr>
-        <w:jc w:val="center"/>
-        <w:rPr>
-          <w:lang w:val="es-GT"/>
-        </w:rPr>
-      </w:pPr>
-    </w:p>
-    <w:p>
-      <w:pPr>
-        <w:pStyle w:val="ListParagraph"/>
+        <w:t>Cotizaciones de Productos</w:t>
+      </w:r>
+      <w:bookmarkEnd w:id="26"/>
+      <w:r>
+        <w:rPr>
+          <w:lang w:val="es-GT"/>
+        </w:rPr>
+        <w:t xml:space="preserve"> </w:t>
+      </w:r>
+    </w:p>
+    <w:p>
+      <w:pPr>
+        <w:pStyle w:val="Prrafodelista"/>
         <w:numPr>
           <w:ilvl w:val="0"/>
           <w:numId w:val="48"/>
@@ -13429,7 +14007,7 @@
     </w:p>
     <w:p>
       <w:pPr>
-        <w:pStyle w:val="ListParagraph"/>
+        <w:pStyle w:val="Prrafodelista"/>
         <w:numPr>
           <w:ilvl w:val="0"/>
           <w:numId w:val="48"/>
@@ -13447,7 +14025,7 @@
     </w:p>
     <w:p>
       <w:pPr>
-        <w:pStyle w:val="ListParagraph"/>
+        <w:pStyle w:val="Prrafodelista"/>
         <w:numPr>
           <w:ilvl w:val="0"/>
           <w:numId w:val="48"/>
@@ -13479,7 +14057,7 @@
     </w:p>
     <w:p>
       <w:pPr>
-        <w:pStyle w:val="ListParagraph"/>
+        <w:pStyle w:val="Prrafodelista"/>
         <w:numPr>
           <w:ilvl w:val="0"/>
           <w:numId w:val="48"/>
@@ -13525,7 +14103,7 @@
     </w:p>
     <w:p>
       <w:pPr>
-        <w:pStyle w:val="ListParagraph"/>
+        <w:pStyle w:val="Prrafodelista"/>
         <w:numPr>
           <w:ilvl w:val="0"/>
           <w:numId w:val="48"/>
@@ -13571,7 +14149,7 @@
     </w:p>
     <w:p>
       <w:pPr>
-        <w:pStyle w:val="ListParagraph"/>
+        <w:pStyle w:val="Prrafodelista"/>
         <w:numPr>
           <w:ilvl w:val="0"/>
           <w:numId w:val="48"/>
@@ -13712,9 +14290,9 @@
         </w:rPr>
         <w:lastRenderedPageBreak/>
         <w:drawing>
-          <wp:inline distT="0" distB="0" distL="0" distR="0" wp14:anchorId="648FAF1D" wp14:editId="35450535">
-            <wp:extent cx="4398264" cy="2227882"/>
-            <wp:effectExtent l="0" t="0" r="2540" b="1270"/>
+          <wp:inline distT="0" distB="0" distL="0" distR="0" wp14:anchorId="648FAF1D" wp14:editId="687D5F67">
+            <wp:extent cx="4768962" cy="2415654"/>
+            <wp:effectExtent l="0" t="0" r="0" b="3810"/>
             <wp:docPr id="1174696261" name="Picture 33"/>
             <wp:cNvGraphicFramePr>
               <a:graphicFrameLocks xmlns:a="http://schemas.openxmlformats.org/drawingml/2006/main" noChangeAspect="1"/>
@@ -13741,7 +14319,7 @@
                   <pic:spPr>
                     <a:xfrm>
                       <a:off x="0" y="0"/>
-                      <a:ext cx="4398264" cy="2227882"/>
+                      <a:ext cx="4772928" cy="2417663"/>
                     </a:xfrm>
                     <a:prstGeom prst="rect">
                       <a:avLst/>
@@ -13768,9 +14346,9 @@
           <w:noProof/>
         </w:rPr>
         <w:drawing>
-          <wp:inline distT="0" distB="0" distL="0" distR="0" wp14:anchorId="425FFA56" wp14:editId="1BFF895A">
-            <wp:extent cx="4398264" cy="2132861"/>
-            <wp:effectExtent l="0" t="0" r="2540" b="1270"/>
+          <wp:inline distT="0" distB="0" distL="0" distR="0" wp14:anchorId="425FFA56" wp14:editId="3D9B434D">
+            <wp:extent cx="4763069" cy="2309767"/>
+            <wp:effectExtent l="0" t="0" r="0" b="0"/>
             <wp:docPr id="2062022138" name="Picture 34"/>
             <wp:cNvGraphicFramePr>
               <a:graphicFrameLocks xmlns:a="http://schemas.openxmlformats.org/drawingml/2006/main" noChangeAspect="1"/>
@@ -13797,7 +14375,7 @@
                   <pic:spPr>
                     <a:xfrm>
                       <a:off x="0" y="0"/>
-                      <a:ext cx="4398264" cy="2132861"/>
+                      <a:ext cx="4775951" cy="2316014"/>
                     </a:xfrm>
                     <a:prstGeom prst="rect">
                       <a:avLst/>
@@ -13824,9 +14402,9 @@
           <w:noProof/>
         </w:rPr>
         <w:drawing>
-          <wp:inline distT="0" distB="0" distL="0" distR="0" wp14:anchorId="178620BE" wp14:editId="2EF22EF0">
-            <wp:extent cx="4398264" cy="2229831"/>
-            <wp:effectExtent l="0" t="0" r="2540" b="0"/>
+          <wp:inline distT="0" distB="0" distL="0" distR="0" wp14:anchorId="178620BE" wp14:editId="2CD3DAA2">
+            <wp:extent cx="4858603" cy="2463213"/>
+            <wp:effectExtent l="0" t="0" r="0" b="0"/>
             <wp:docPr id="1223975545" name="Picture 35"/>
             <wp:cNvGraphicFramePr>
               <a:graphicFrameLocks xmlns:a="http://schemas.openxmlformats.org/drawingml/2006/main" noChangeAspect="1"/>
@@ -13853,7 +14431,7 @@
                   <pic:spPr>
                     <a:xfrm>
                       <a:off x="0" y="0"/>
-                      <a:ext cx="4398264" cy="2229831"/>
+                      <a:ext cx="4867921" cy="2467937"/>
                     </a:xfrm>
                     <a:prstGeom prst="rect">
                       <a:avLst/>
@@ -13866,31 +14444,8 @@
         </w:drawing>
       </w:r>
     </w:p>
-    <w:p>
-      <w:pPr>
-        <w:jc w:val="center"/>
-      </w:pPr>
-    </w:p>
-    <w:p>
-      <w:pPr>
-        <w:jc w:val="center"/>
-      </w:pPr>
-    </w:p>
-    <w:p>
-      <w:pPr>
-        <w:jc w:val="center"/>
-      </w:pPr>
-    </w:p>
-    <w:p>
-      <w:pPr>
-        <w:jc w:val="center"/>
-      </w:pPr>
-    </w:p>
-    <w:p>
-      <w:pPr>
-        <w:jc w:val="center"/>
-      </w:pPr>
-    </w:p>
+    <w:p/>
+    <w:p/>
     <w:p>
       <w:pPr>
         <w:jc w:val="left"/>
@@ -14013,14 +14568,6 @@
         <w:t>e</w:t>
       </w:r>
       <w:proofErr w:type="spellEnd"/>
-    </w:p>
-    <w:p>
-      <w:pPr>
-        <w:jc w:val="center"/>
-        <w:rPr>
-          <w:lang w:val="es-GT"/>
-        </w:rPr>
-      </w:pPr>
     </w:p>
     <w:p>
       <w:pPr>
@@ -14091,42 +14638,30 @@
         </w:rPr>
         <w:t xml:space="preserve">Necesitamos </w:t>
       </w:r>
-      <w:proofErr w:type="spellStart"/>
-      <w:r>
-        <w:rPr>
-          <w:lang w:val="es-GT"/>
-        </w:rPr>
-        <w:t>Actividar</w:t>
-      </w:r>
-      <w:proofErr w:type="spellEnd"/>
+      <w:r>
+        <w:rPr>
+          <w:lang w:val="es-GT"/>
+        </w:rPr>
+        <w:t>activar</w:t>
+      </w:r>
       <w:r>
         <w:rPr>
           <w:lang w:val="es-GT"/>
         </w:rPr>
         <w:t xml:space="preserve"> la verificación en 2 pasos del correo que vayamos a </w:t>
       </w:r>
-      <w:proofErr w:type="spellStart"/>
-      <w:r>
-        <w:rPr>
-          <w:lang w:val="es-GT"/>
-        </w:rPr>
-        <w:t>utliizar</w:t>
-      </w:r>
-      <w:proofErr w:type="spellEnd"/>
+      <w:r>
+        <w:rPr>
+          <w:lang w:val="es-GT"/>
+        </w:rPr>
+        <w:t>utilizar</w:t>
+      </w:r>
       <w:r>
         <w:rPr>
           <w:lang w:val="es-GT"/>
         </w:rPr>
         <w:t xml:space="preserve"> y generar una contraseña de aplicación.</w:t>
       </w:r>
-    </w:p>
-    <w:p>
-      <w:pPr>
-        <w:jc w:val="center"/>
-        <w:rPr>
-          <w:lang w:val="es-GT"/>
-        </w:rPr>
-      </w:pPr>
     </w:p>
     <w:p>
       <w:pPr>
@@ -14221,6 +14756,16 @@
     </w:p>
     <w:p>
       <w:pPr>
+        <w:jc w:val="center"/>
+      </w:pPr>
+    </w:p>
+    <w:p>
+      <w:pPr>
+        <w:jc w:val="center"/>
+      </w:pPr>
+    </w:p>
+    <w:p>
+      <w:pPr>
         <w:jc w:val="left"/>
         <w:rPr>
           <w:lang w:val="es-GT"/>
@@ -14231,16 +14776,22 @@
           <w:lang w:val="es-GT"/>
         </w:rPr>
         <w:lastRenderedPageBreak/>
-        <w:t>Para crear la contraseña de aplicación accedemos al siguiente link:</w:t>
-      </w:r>
-    </w:p>
-    <w:p>
-      <w:pPr>
-        <w:jc w:val="left"/>
-        <w:rPr>
-          <w:lang w:val="es-GT"/>
-        </w:rPr>
-      </w:pPr>
+        <w:t xml:space="preserve">Para crear la contraseña de aplicación accedemos al siguiente </w:t>
+      </w:r>
+      <w:proofErr w:type="gramStart"/>
+      <w:r>
+        <w:rPr>
+          <w:lang w:val="es-GT"/>
+        </w:rPr>
+        <w:t>link</w:t>
+      </w:r>
+      <w:proofErr w:type="gramEnd"/>
+      <w:r>
+        <w:rPr>
+          <w:lang w:val="es-GT"/>
+        </w:rPr>
+        <w:t>:</w:t>
+      </w:r>
     </w:p>
     <w:p>
       <w:pPr>
@@ -14252,14 +14803,13 @@
       <w:hyperlink r:id="rId53" w:history="1">
         <w:r>
           <w:rPr>
-            <w:rStyle w:val="Hyperlink"/>
+            <w:rStyle w:val="Hipervnculo"/>
             <w:lang w:val="es-GT"/>
           </w:rPr>
           <w:t>https://myaccount.google.com/apppasswords</w:t>
         </w:r>
       </w:hyperlink>
     </w:p>
-    <w:p/>
     <w:p>
       <w:pPr>
         <w:jc w:val="center"/>
@@ -14311,44 +14861,69 @@
         </w:drawing>
       </w:r>
     </w:p>
-    <w:p>
-      <w:pPr>
-        <w:jc w:val="center"/>
-      </w:pPr>
-    </w:p>
-    <w:p>
-      <w:pPr>
-        <w:rPr>
-          <w:lang w:val="es-GT"/>
-        </w:rPr>
-      </w:pPr>
-      <w:r>
-        <w:rPr>
-          <w:b/>
-          <w:bCs/>
-          <w:lang w:val="es-GT"/>
-        </w:rPr>
-        <w:t>Configurar servidor de salida SMTP</w:t>
-      </w:r>
-    </w:p>
-    <w:p>
-      <w:pPr>
-        <w:jc w:val="center"/>
-        <w:rPr>
-          <w:lang w:val="es-GT"/>
-        </w:rPr>
-      </w:pPr>
-    </w:p>
-    <w:p>
-      <w:pPr>
+    <w:p/>
+    <w:p>
+      <w:pPr>
+        <w:pStyle w:val="Ttulo3"/>
         <w:rPr>
           <w:lang w:val="en-US"/>
         </w:rPr>
       </w:pPr>
+      <w:bookmarkStart w:id="27" w:name="_Toc226654635"/>
+      <w:proofErr w:type="spellStart"/>
       <w:r>
         <w:rPr>
           <w:lang w:val="en-US"/>
         </w:rPr>
+        <w:t>Configurar</w:t>
+      </w:r>
+      <w:proofErr w:type="spellEnd"/>
+      <w:r>
+        <w:rPr>
+          <w:lang w:val="en-US"/>
+        </w:rPr>
+        <w:t xml:space="preserve"> </w:t>
+      </w:r>
+      <w:proofErr w:type="spellStart"/>
+      <w:r>
+        <w:rPr>
+          <w:lang w:val="en-US"/>
+        </w:rPr>
+        <w:t>servidor</w:t>
+      </w:r>
+      <w:proofErr w:type="spellEnd"/>
+      <w:r>
+        <w:rPr>
+          <w:lang w:val="en-US"/>
+        </w:rPr>
+        <w:t xml:space="preserve"> de </w:t>
+      </w:r>
+      <w:proofErr w:type="spellStart"/>
+      <w:r>
+        <w:rPr>
+          <w:lang w:val="en-US"/>
+        </w:rPr>
+        <w:t>salida</w:t>
+      </w:r>
+      <w:proofErr w:type="spellEnd"/>
+      <w:r>
+        <w:rPr>
+          <w:lang w:val="en-US"/>
+        </w:rPr>
+        <w:t xml:space="preserve"> SMTP</w:t>
+      </w:r>
+      <w:bookmarkEnd w:id="27"/>
+    </w:p>
+    <w:p>
+      <w:pPr>
+        <w:rPr>
+          <w:lang w:val="en-US"/>
+        </w:rPr>
+      </w:pPr>
+      <w:r>
+        <w:rPr>
+          <w:lang w:val="en-US"/>
+        </w:rPr>
         <w:t xml:space="preserve"> Settings → Technical → Email → Outgoing Mail Servers → New</w:t>
       </w:r>
     </w:p>
@@ -14377,13 +14952,6 @@
         </w:rPr>
         <w:t>Si todo funciona bien debemos ver un mensaje de éxito a la izquierda:</w:t>
       </w:r>
-    </w:p>
-    <w:p>
-      <w:pPr>
-        <w:rPr>
-          <w:lang w:val="es-GT"/>
-        </w:rPr>
-      </w:pPr>
     </w:p>
     <w:p>
       <w:pPr>
@@ -14444,26 +15012,14 @@
         <w:jc w:val="center"/>
       </w:pPr>
     </w:p>
-    <w:p>
-      <w:pPr>
-        <w:jc w:val="center"/>
-      </w:pPr>
-    </w:p>
-    <w:p>
-      <w:pPr>
-        <w:jc w:val="center"/>
-      </w:pPr>
-    </w:p>
-    <w:p>
-      <w:pPr>
-        <w:jc w:val="center"/>
-      </w:pPr>
-    </w:p>
-    <w:p>
-      <w:pPr>
-        <w:jc w:val="center"/>
-      </w:pPr>
-    </w:p>
+    <w:p/>
+    <w:p/>
+    <w:p/>
+    <w:p/>
+    <w:p/>
+    <w:p/>
+    <w:p/>
+    <w:p/>
     <w:p>
       <w:pPr>
         <w:rPr>
@@ -14480,15 +15036,7 @@
     </w:p>
     <w:p>
       <w:pPr>
-        <w:jc w:val="center"/>
-        <w:rPr>
-          <w:lang w:val="es-GT"/>
-        </w:rPr>
-      </w:pPr>
-    </w:p>
-    <w:p>
-      <w:pPr>
-        <w:pStyle w:val="ListParagraph"/>
+        <w:pStyle w:val="Prrafodelista"/>
         <w:numPr>
           <w:ilvl w:val="0"/>
           <w:numId w:val="49"/>
@@ -14506,61 +15054,25 @@
     </w:p>
     <w:p>
       <w:pPr>
-        <w:pStyle w:val="ListParagraph"/>
+        <w:pStyle w:val="Prrafodelista"/>
         <w:numPr>
           <w:ilvl w:val="0"/>
           <w:numId w:val="49"/>
         </w:numPr>
         <w:rPr>
-          <w:lang w:val="es-GT"/>
-        </w:rPr>
-      </w:pPr>
-      <w:r>
-        <w:rPr>
-          <w:lang w:val="es-GT"/>
-        </w:rPr>
-        <w:t xml:space="preserve">Ve a </w:t>
-      </w:r>
-      <w:proofErr w:type="spellStart"/>
-      <w:r>
-        <w:rPr>
-          <w:lang w:val="es-GT"/>
-        </w:rPr>
-        <w:t>Settings</w:t>
-      </w:r>
-      <w:proofErr w:type="spellEnd"/>
-      <w:r>
-        <w:rPr>
-          <w:lang w:val="es-GT"/>
-        </w:rPr>
-        <w:t xml:space="preserve"> → </w:t>
-      </w:r>
-      <w:proofErr w:type="spellStart"/>
-      <w:r>
-        <w:rPr>
-          <w:lang w:val="es-GT"/>
-        </w:rPr>
-        <w:t>Technical</w:t>
-      </w:r>
-      <w:proofErr w:type="spellEnd"/>
-      <w:r>
-        <w:rPr>
-          <w:lang w:val="es-GT"/>
-        </w:rPr>
-        <w:t xml:space="preserve"> → Email </w:t>
-      </w:r>
-      <w:proofErr w:type="spellStart"/>
-      <w:r>
-        <w:rPr>
-          <w:lang w:val="es-GT"/>
-        </w:rPr>
-        <w:t>Templates</w:t>
-      </w:r>
-      <w:proofErr w:type="spellEnd"/>
-    </w:p>
-    <w:p>
-      <w:pPr>
-        <w:pStyle w:val="ListParagraph"/>
+          <w:lang w:val="en-US"/>
+        </w:rPr>
+      </w:pPr>
+      <w:r>
+        <w:rPr>
+          <w:lang w:val="en-US"/>
+        </w:rPr>
+        <w:t>Ve a Settings → Technical → Email Templates</w:t>
+      </w:r>
+    </w:p>
+    <w:p>
+      <w:pPr>
+        <w:pStyle w:val="Prrafodelista"/>
         <w:numPr>
           <w:ilvl w:val="0"/>
           <w:numId w:val="49"/>
@@ -14597,11 +15109,6 @@
         </w:rPr>
         <w:t>:</w:t>
       </w:r>
-    </w:p>
-    <w:p>
-      <w:pPr>
-        <w:jc w:val="center"/>
-      </w:pPr>
     </w:p>
     <w:p>
       <w:pPr>
@@ -14670,16 +15177,14 @@
         <w:rPr>
           <w:lang w:val="es-GT"/>
         </w:rPr>
-        <w:t>Tienes que tener a un usuario con correo electrónico configurado.</w:t>
-      </w:r>
-    </w:p>
-    <w:p>
-      <w:pPr>
-        <w:jc w:val="center"/>
-        <w:rPr>
-          <w:lang w:val="es-GT"/>
-        </w:rPr>
-      </w:pPr>
+        <w:t>Debes tener</w:t>
+      </w:r>
+      <w:r>
+        <w:rPr>
+          <w:lang w:val="es-GT"/>
+        </w:rPr>
+        <w:t xml:space="preserve"> a un usuario con correo electrónico configurado.</w:t>
+      </w:r>
     </w:p>
     <w:p>
       <w:pPr>
@@ -14734,42 +15239,7 @@
     </w:p>
     <w:p>
       <w:pPr>
-        <w:jc w:val="center"/>
-      </w:pPr>
-    </w:p>
-    <w:p>
-      <w:pPr>
-        <w:jc w:val="center"/>
-      </w:pPr>
-    </w:p>
-    <w:p>
-      <w:pPr>
-        <w:jc w:val="center"/>
-      </w:pPr>
-    </w:p>
-    <w:p>
-      <w:pPr>
-        <w:jc w:val="center"/>
-      </w:pPr>
-    </w:p>
-    <w:p>
-      <w:pPr>
-        <w:jc w:val="center"/>
-      </w:pPr>
-    </w:p>
-    <w:p>
-      <w:pPr>
-        <w:jc w:val="center"/>
-      </w:pPr>
-    </w:p>
-    <w:p>
-      <w:pPr>
-        <w:jc w:val="center"/>
-      </w:pPr>
-    </w:p>
-    <w:p>
-      <w:pPr>
-        <w:pStyle w:val="ListParagraph"/>
+        <w:pStyle w:val="Prrafodelista"/>
         <w:numPr>
           <w:ilvl w:val="0"/>
           <w:numId w:val="51"/>
@@ -14782,13 +15252,12 @@
         <w:rPr>
           <w:lang w:val="es-GT"/>
         </w:rPr>
-        <w:lastRenderedPageBreak/>
         <w:t>Ve a CRM</w:t>
       </w:r>
     </w:p>
     <w:p>
       <w:pPr>
-        <w:pStyle w:val="ListParagraph"/>
+        <w:pStyle w:val="Prrafodelista"/>
         <w:numPr>
           <w:ilvl w:val="0"/>
           <w:numId w:val="51"/>
@@ -14806,7 +15275,7 @@
     </w:p>
     <w:p>
       <w:pPr>
-        <w:pStyle w:val="ListParagraph"/>
+        <w:pStyle w:val="Prrafodelista"/>
         <w:numPr>
           <w:ilvl w:val="0"/>
           <w:numId w:val="51"/>
@@ -14846,7 +15315,7 @@
     </w:p>
     <w:p>
       <w:pPr>
-        <w:pStyle w:val="ListParagraph"/>
+        <w:pStyle w:val="Prrafodelista"/>
         <w:numPr>
           <w:ilvl w:val="0"/>
           <w:numId w:val="51"/>
@@ -14878,7 +15347,7 @@
     </w:p>
     <w:p>
       <w:pPr>
-        <w:pStyle w:val="ListParagraph"/>
+        <w:pStyle w:val="Prrafodelista"/>
         <w:numPr>
           <w:ilvl w:val="0"/>
           <w:numId w:val="51"/>
@@ -14896,7 +15365,7 @@
     </w:p>
     <w:p>
       <w:pPr>
-        <w:pStyle w:val="ListParagraph"/>
+        <w:pStyle w:val="Prrafodelista"/>
         <w:numPr>
           <w:ilvl w:val="0"/>
           <w:numId w:val="51"/>
@@ -14914,7 +15383,7 @@
     </w:p>
     <w:p>
       <w:pPr>
-        <w:pStyle w:val="ListParagraph"/>
+        <w:pStyle w:val="Prrafodelista"/>
         <w:numPr>
           <w:ilvl w:val="0"/>
           <w:numId w:val="51"/>
@@ -14942,19 +15411,15 @@
       <w:pPr>
         <w:jc w:val="center"/>
       </w:pPr>
-    </w:p>
-    <w:p>
-      <w:pPr>
-        <w:jc w:val="center"/>
-      </w:pPr>
       <w:r>
         <w:rPr>
           <w:noProof/>
         </w:rPr>
+        <w:lastRenderedPageBreak/>
         <w:drawing>
-          <wp:inline distT="0" distB="0" distL="0" distR="0" wp14:anchorId="5744DFB2" wp14:editId="54206B8E">
-            <wp:extent cx="4398264" cy="2233242"/>
-            <wp:effectExtent l="0" t="0" r="2540" b="0"/>
+          <wp:inline distT="0" distB="0" distL="0" distR="0" wp14:anchorId="5744DFB2" wp14:editId="406BB4E9">
+            <wp:extent cx="4076700" cy="2069966"/>
+            <wp:effectExtent l="0" t="0" r="0" b="6985"/>
             <wp:docPr id="1408051031" name="Picture 42"/>
             <wp:cNvGraphicFramePr>
               <a:graphicFrameLocks xmlns:a="http://schemas.openxmlformats.org/drawingml/2006/main" noChangeAspect="1"/>
@@ -14981,7 +15446,7 @@
                   <pic:spPr>
                     <a:xfrm>
                       <a:off x="0" y="0"/>
-                      <a:ext cx="4398264" cy="2233242"/>
+                      <a:ext cx="4079677" cy="2071477"/>
                     </a:xfrm>
                     <a:prstGeom prst="rect">
                       <a:avLst/>
@@ -15003,9 +15468,9 @@
           <w:noProof/>
         </w:rPr>
         <w:drawing>
-          <wp:inline distT="0" distB="0" distL="0" distR="0" wp14:anchorId="5118505C" wp14:editId="77D57CC4">
-            <wp:extent cx="4407408" cy="2242280"/>
-            <wp:effectExtent l="0" t="0" r="0" b="5715"/>
+          <wp:inline distT="0" distB="0" distL="0" distR="0" wp14:anchorId="5118505C" wp14:editId="26A26E3C">
+            <wp:extent cx="4086225" cy="2078878"/>
+            <wp:effectExtent l="0" t="0" r="0" b="0"/>
             <wp:docPr id="1166022011" name="Picture 43"/>
             <wp:cNvGraphicFramePr>
               <a:graphicFrameLocks xmlns:a="http://schemas.openxmlformats.org/drawingml/2006/main" noChangeAspect="1"/>
@@ -15032,7 +15497,7 @@
                   <pic:spPr>
                     <a:xfrm>
                       <a:off x="0" y="0"/>
-                      <a:ext cx="4407408" cy="2242280"/>
+                      <a:ext cx="4094046" cy="2082857"/>
                     </a:xfrm>
                     <a:prstGeom prst="rect">
                       <a:avLst/>
@@ -15053,11 +15518,10 @@
         <w:rPr>
           <w:noProof/>
         </w:rPr>
-        <w:lastRenderedPageBreak/>
         <w:drawing>
-          <wp:inline distT="0" distB="0" distL="0" distR="0" wp14:anchorId="7BB91F5F" wp14:editId="79DEEA75">
-            <wp:extent cx="4398264" cy="2219111"/>
-            <wp:effectExtent l="0" t="0" r="2540" b="0"/>
+          <wp:inline distT="0" distB="0" distL="0" distR="0" wp14:anchorId="7BB91F5F" wp14:editId="07D2375C">
+            <wp:extent cx="4170888" cy="2104390"/>
+            <wp:effectExtent l="0" t="0" r="1270" b="0"/>
             <wp:docPr id="1556812609" name="Picture 44"/>
             <wp:cNvGraphicFramePr>
               <a:graphicFrameLocks xmlns:a="http://schemas.openxmlformats.org/drawingml/2006/main" noChangeAspect="1"/>
@@ -15084,7 +15548,7 @@
                   <pic:spPr>
                     <a:xfrm>
                       <a:off x="0" y="0"/>
-                      <a:ext cx="4398264" cy="2219111"/>
+                      <a:ext cx="4172808" cy="2105359"/>
                     </a:xfrm>
                     <a:prstGeom prst="rect">
                       <a:avLst/>
@@ -15101,19 +15565,14 @@
       <w:pPr>
         <w:jc w:val="center"/>
       </w:pPr>
-    </w:p>
-    <w:p>
-      <w:pPr>
-        <w:jc w:val="center"/>
-      </w:pPr>
       <w:r>
         <w:rPr>
           <w:noProof/>
         </w:rPr>
         <w:drawing>
-          <wp:inline distT="0" distB="0" distL="0" distR="0" wp14:anchorId="375EB4D6" wp14:editId="626F9DD8">
-            <wp:extent cx="4398264" cy="2255170"/>
-            <wp:effectExtent l="0" t="0" r="2540" b="0"/>
+          <wp:inline distT="0" distB="0" distL="0" distR="0" wp14:anchorId="375EB4D6" wp14:editId="385AA0A9">
+            <wp:extent cx="4267672" cy="2188210"/>
+            <wp:effectExtent l="0" t="0" r="0" b="2540"/>
             <wp:docPr id="979738348" name="Picture 45"/>
             <wp:cNvGraphicFramePr>
               <a:graphicFrameLocks xmlns:a="http://schemas.openxmlformats.org/drawingml/2006/main" noChangeAspect="1"/>
@@ -15140,7 +15599,7 @@
                   <pic:spPr>
                     <a:xfrm>
                       <a:off x="0" y="0"/>
-                      <a:ext cx="4398264" cy="2255170"/>
+                      <a:ext cx="4269331" cy="2189061"/>
                     </a:xfrm>
                     <a:prstGeom prst="rect">
                       <a:avLst/>
@@ -15203,7 +15662,7 @@
     <w:sdtContent>
       <w:p>
         <w:pPr>
-          <w:pStyle w:val="Footer"/>
+          <w:pStyle w:val="Piedepgina"/>
           <w:jc w:val="right"/>
         </w:pPr>
         <w:r>
@@ -15229,12 +15688,12 @@
   </w:sdt>
   <w:p>
     <w:pPr>
-      <w:pStyle w:val="Footer"/>
+      <w:pStyle w:val="Piedepgina"/>
     </w:pPr>
   </w:p>
   <w:p>
     <w:pPr>
-      <w:pStyle w:val="Footer"/>
+      <w:pStyle w:val="Piedepgina"/>
     </w:pPr>
   </w:p>
 </w:ftr>
@@ -17473,7 +17932,7 @@
     <w:lvl w:ilvl="0" w:tplc="9F68D574">
       <w:start w:val="1"/>
       <w:numFmt w:val="decimal"/>
-      <w:pStyle w:val="Heading1"/>
+      <w:pStyle w:val="Ttulo1"/>
       <w:lvlText w:val="%1."/>
       <w:lvlJc w:val="left"/>
       <w:pPr>
@@ -17483,7 +17942,7 @@
     <w:lvl w:ilvl="1" w:tplc="7FC08784">
       <w:start w:val="1"/>
       <w:numFmt w:val="lowerLetter"/>
-      <w:pStyle w:val="Heading2"/>
+      <w:pStyle w:val="Ttulo2"/>
       <w:lvlText w:val="%2."/>
       <w:lvlJc w:val="left"/>
       <w:pPr>
@@ -18085,7 +18544,7 @@
     <w:lvl w:ilvl="0" w:tplc="8E945ED4">
       <w:start w:val="1"/>
       <w:numFmt w:val="lowerLetter"/>
-      <w:pStyle w:val="Heading3"/>
+      <w:pStyle w:val="Ttulo3"/>
       <w:lvlText w:val="%1."/>
       <w:lvlJc w:val="left"/>
       <w:pPr>
@@ -20888,6 +21347,18 @@
   </w:num>
   <w:num w:numId="51" w16cid:durableId="1025640231">
     <w:abstractNumId w:val="16"/>
+  </w:num>
+  <w:num w:numId="52" w16cid:durableId="159466592">
+    <w:abstractNumId w:val="23"/>
+    <w:lvlOverride w:ilvl="0">
+      <w:startOverride w:val="1"/>
+    </w:lvlOverride>
+  </w:num>
+  <w:num w:numId="53" w16cid:durableId="1267232264">
+    <w:abstractNumId w:val="23"/>
+    <w:lvlOverride w:ilvl="0">
+      <w:startOverride w:val="1"/>
+    </w:lvlOverride>
   </w:num>
   <w:numIdMacAtCleanup w:val="43"/>
 </w:numbering>
@@ -21301,11 +21772,11 @@
       <w:sz w:val="24"/>
     </w:rPr>
   </w:style>
-  <w:style w:type="paragraph" w:styleId="Heading1">
+  <w:style w:type="paragraph" w:styleId="Ttulo1">
     <w:name w:val="heading 1"/>
     <w:basedOn w:val="Normal"/>
     <w:next w:val="Normal"/>
-    <w:link w:val="Heading1Char"/>
+    <w:link w:val="Ttulo1Car"/>
     <w:uiPriority w:val="9"/>
     <w:qFormat/>
     <w:rsid w:val="00353BE4"/>
@@ -21321,11 +21792,11 @@
       <w:sz w:val="32"/>
     </w:rPr>
   </w:style>
-  <w:style w:type="paragraph" w:styleId="Heading2">
+  <w:style w:type="paragraph" w:styleId="Ttulo2">
     <w:name w:val="heading 2"/>
-    <w:basedOn w:val="Heading1"/>
+    <w:basedOn w:val="Ttulo1"/>
     <w:next w:val="Normal"/>
-    <w:link w:val="Heading2Char"/>
+    <w:link w:val="Ttulo2Car"/>
     <w:uiPriority w:val="9"/>
     <w:unhideWhenUsed/>
     <w:qFormat/>
@@ -21341,11 +21812,11 @@
       <w:sz w:val="28"/>
     </w:rPr>
   </w:style>
-  <w:style w:type="paragraph" w:styleId="Heading3">
+  <w:style w:type="paragraph" w:styleId="Ttulo3">
     <w:name w:val="heading 3"/>
-    <w:basedOn w:val="Heading2"/>
+    <w:basedOn w:val="Ttulo2"/>
     <w:next w:val="Normal"/>
-    <w:link w:val="Heading3Char"/>
+    <w:link w:val="Ttulo3Car"/>
     <w:uiPriority w:val="9"/>
     <w:unhideWhenUsed/>
     <w:qFormat/>
@@ -21362,11 +21833,11 @@
       <w:sz w:val="24"/>
     </w:rPr>
   </w:style>
-  <w:style w:type="paragraph" w:styleId="Heading4">
+  <w:style w:type="paragraph" w:styleId="Ttulo4">
     <w:name w:val="heading 4"/>
     <w:basedOn w:val="Normal"/>
     <w:next w:val="Normal"/>
-    <w:link w:val="Heading4Char"/>
+    <w:link w:val="Ttulo4Car"/>
     <w:uiPriority w:val="9"/>
     <w:semiHidden/>
     <w:unhideWhenUsed/>
@@ -21385,12 +21856,13 @@
       <w:color w:val="2E74B5" w:themeColor="accent1" w:themeShade="BF"/>
     </w:rPr>
   </w:style>
-  <w:style w:type="character" w:default="1" w:styleId="DefaultParagraphFont">
+  <w:style w:type="character" w:default="1" w:styleId="Fuentedeprrafopredeter">
     <w:name w:val="Default Paragraph Font"/>
     <w:uiPriority w:val="1"/>
+    <w:semiHidden/>
     <w:unhideWhenUsed/>
   </w:style>
-  <w:style w:type="table" w:default="1" w:styleId="TableNormal">
+  <w:style w:type="table" w:default="1" w:styleId="Tablanormal">
     <w:name w:val="Normal Table"/>
     <w:uiPriority w:val="99"/>
     <w:semiHidden/>
@@ -21405,15 +21877,15 @@
       </w:tblCellMar>
     </w:tblPr>
   </w:style>
-  <w:style w:type="numbering" w:default="1" w:styleId="NoList">
+  <w:style w:type="numbering" w:default="1" w:styleId="Sinlista">
     <w:name w:val="No List"/>
     <w:uiPriority w:val="99"/>
     <w:semiHidden/>
     <w:unhideWhenUsed/>
   </w:style>
-  <w:style w:type="table" w:styleId="TableGrid">
+  <w:style w:type="table" w:styleId="Tablaconcuadrcula">
     <w:name w:val="Table Grid"/>
-    <w:basedOn w:val="TableNormal"/>
+    <w:basedOn w:val="Tablanormal"/>
     <w:uiPriority w:val="39"/>
     <w:rsid w:val="00265C67"/>
     <w:pPr>
@@ -21430,10 +21902,10 @@
       </w:tblBorders>
     </w:tblPr>
   </w:style>
-  <w:style w:type="character" w:customStyle="1" w:styleId="Heading1Char">
-    <w:name w:val="Heading 1 Char"/>
-    <w:basedOn w:val="DefaultParagraphFont"/>
-    <w:link w:val="Heading1"/>
+  <w:style w:type="character" w:customStyle="1" w:styleId="Ttulo1Car">
+    <w:name w:val="Título 1 Car"/>
+    <w:basedOn w:val="Fuentedeprrafopredeter"/>
+    <w:link w:val="Ttulo1"/>
     <w:uiPriority w:val="9"/>
     <w:rsid w:val="00353BE4"/>
     <w:rPr>
@@ -21442,10 +21914,10 @@
       <w:sz w:val="32"/>
     </w:rPr>
   </w:style>
-  <w:style w:type="character" w:customStyle="1" w:styleId="Heading2Char">
-    <w:name w:val="Heading 2 Char"/>
-    <w:basedOn w:val="DefaultParagraphFont"/>
-    <w:link w:val="Heading2"/>
+  <w:style w:type="character" w:customStyle="1" w:styleId="Ttulo2Car">
+    <w:name w:val="Título 2 Car"/>
+    <w:basedOn w:val="Fuentedeprrafopredeter"/>
+    <w:link w:val="Ttulo2"/>
     <w:uiPriority w:val="9"/>
     <w:rsid w:val="00353BE4"/>
     <w:rPr>
@@ -21454,9 +21926,9 @@
       <w:sz w:val="28"/>
     </w:rPr>
   </w:style>
-  <w:style w:type="paragraph" w:styleId="TOCHeading">
+  <w:style w:type="paragraph" w:styleId="TtuloTDC">
     <w:name w:val="TOC Heading"/>
-    <w:basedOn w:val="Heading1"/>
+    <w:basedOn w:val="Ttulo1"/>
     <w:next w:val="Normal"/>
     <w:uiPriority w:val="39"/>
     <w:unhideWhenUsed/>
@@ -21480,7 +21952,7 @@
       <w:lang w:eastAsia="es-ES"/>
     </w:rPr>
   </w:style>
-  <w:style w:type="paragraph" w:styleId="TOC1">
+  <w:style w:type="paragraph" w:styleId="TDC1">
     <w:name w:val="toc 1"/>
     <w:basedOn w:val="Normal"/>
     <w:next w:val="Normal"/>
@@ -21492,7 +21964,7 @@
       <w:spacing w:after="100"/>
     </w:pPr>
   </w:style>
-  <w:style w:type="paragraph" w:styleId="TOC2">
+  <w:style w:type="paragraph" w:styleId="TDC2">
     <w:name w:val="toc 2"/>
     <w:basedOn w:val="Normal"/>
     <w:next w:val="Normal"/>
@@ -21505,9 +21977,9 @@
       <w:ind w:left="220"/>
     </w:pPr>
   </w:style>
-  <w:style w:type="character" w:styleId="Hyperlink">
+  <w:style w:type="character" w:styleId="Hipervnculo">
     <w:name w:val="Hyperlink"/>
-    <w:basedOn w:val="DefaultParagraphFont"/>
+    <w:basedOn w:val="Fuentedeprrafopredeter"/>
     <w:uiPriority w:val="99"/>
     <w:unhideWhenUsed/>
     <w:rsid w:val="00353BE4"/>
@@ -21516,7 +21988,7 @@
       <w:u w:val="single"/>
     </w:rPr>
   </w:style>
-  <w:style w:type="paragraph" w:styleId="ListParagraph">
+  <w:style w:type="paragraph" w:styleId="Prrafodelista">
     <w:name w:val="List Paragraph"/>
     <w:basedOn w:val="Normal"/>
     <w:qFormat/>
@@ -21526,9 +21998,9 @@
       <w:contextualSpacing/>
     </w:pPr>
   </w:style>
-  <w:style w:type="character" w:styleId="HTMLCode">
+  <w:style w:type="character" w:styleId="CdigoHTML">
     <w:name w:val="HTML Code"/>
-    <w:basedOn w:val="DefaultParagraphFont"/>
+    <w:basedOn w:val="Fuentedeprrafopredeter"/>
     <w:uiPriority w:val="99"/>
     <w:semiHidden/>
     <w:unhideWhenUsed/>
@@ -21539,10 +22011,10 @@
       <w:szCs w:val="20"/>
     </w:rPr>
   </w:style>
-  <w:style w:type="character" w:customStyle="1" w:styleId="Heading4Char">
-    <w:name w:val="Heading 4 Char"/>
-    <w:basedOn w:val="DefaultParagraphFont"/>
-    <w:link w:val="Heading4"/>
+  <w:style w:type="character" w:customStyle="1" w:styleId="Ttulo4Car">
+    <w:name w:val="Título 4 Car"/>
+    <w:basedOn w:val="Fuentedeprrafopredeter"/>
+    <w:link w:val="Ttulo4"/>
     <w:uiPriority w:val="9"/>
     <w:semiHidden/>
     <w:rsid w:val="007C57BE"/>
@@ -21554,10 +22026,10 @@
       <w:sz w:val="24"/>
     </w:rPr>
   </w:style>
-  <w:style w:type="character" w:customStyle="1" w:styleId="Heading3Char">
-    <w:name w:val="Heading 3 Char"/>
-    <w:basedOn w:val="DefaultParagraphFont"/>
-    <w:link w:val="Heading3"/>
+  <w:style w:type="character" w:customStyle="1" w:styleId="Ttulo3Car">
+    <w:name w:val="Título 3 Car"/>
+    <w:basedOn w:val="Fuentedeprrafopredeter"/>
+    <w:link w:val="Ttulo3"/>
     <w:uiPriority w:val="9"/>
     <w:rsid w:val="000A1B82"/>
     <w:rPr>
@@ -21566,9 +22038,9 @@
       <w:sz w:val="24"/>
     </w:rPr>
   </w:style>
-  <w:style w:type="character" w:styleId="Strong">
+  <w:style w:type="character" w:styleId="Fuerte">
     <w:name w:val="Strong"/>
-    <w:basedOn w:val="DefaultParagraphFont"/>
+    <w:basedOn w:val="Fuentedeprrafopredeter"/>
     <w:uiPriority w:val="22"/>
     <w:qFormat/>
     <w:rsid w:val="00C3338F"/>
@@ -21577,10 +22049,10 @@
       <w:bCs/>
     </w:rPr>
   </w:style>
-  <w:style w:type="paragraph" w:styleId="Header">
+  <w:style w:type="paragraph" w:styleId="Encabezado">
     <w:name w:val="header"/>
     <w:basedOn w:val="Normal"/>
-    <w:link w:val="HeaderChar"/>
+    <w:link w:val="EncabezadoCar"/>
     <w:uiPriority w:val="99"/>
     <w:unhideWhenUsed/>
     <w:rsid w:val="00FA5A9F"/>
@@ -21592,10 +22064,10 @@
       <w:spacing w:line="240" w:lineRule="auto"/>
     </w:pPr>
   </w:style>
-  <w:style w:type="character" w:customStyle="1" w:styleId="HeaderChar">
-    <w:name w:val="Header Char"/>
-    <w:basedOn w:val="DefaultParagraphFont"/>
-    <w:link w:val="Header"/>
+  <w:style w:type="character" w:customStyle="1" w:styleId="EncabezadoCar">
+    <w:name w:val="Encabezado Car"/>
+    <w:basedOn w:val="Fuentedeprrafopredeter"/>
+    <w:link w:val="Encabezado"/>
     <w:uiPriority w:val="99"/>
     <w:rsid w:val="00FA5A9F"/>
     <w:rPr>
@@ -21603,10 +22075,10 @@
       <w:sz w:val="24"/>
     </w:rPr>
   </w:style>
-  <w:style w:type="paragraph" w:styleId="Footer">
+  <w:style w:type="paragraph" w:styleId="Piedepgina">
     <w:name w:val="footer"/>
     <w:basedOn w:val="Normal"/>
-    <w:link w:val="FooterChar"/>
+    <w:link w:val="PiedepginaCar"/>
     <w:uiPriority w:val="99"/>
     <w:unhideWhenUsed/>
     <w:rsid w:val="00FA5A9F"/>
@@ -21618,10 +22090,10 @@
       <w:spacing w:line="240" w:lineRule="auto"/>
     </w:pPr>
   </w:style>
-  <w:style w:type="character" w:customStyle="1" w:styleId="FooterChar">
-    <w:name w:val="Footer Char"/>
-    <w:basedOn w:val="DefaultParagraphFont"/>
-    <w:link w:val="Footer"/>
+  <w:style w:type="character" w:customStyle="1" w:styleId="PiedepginaCar">
+    <w:name w:val="Pie de página Car"/>
+    <w:basedOn w:val="Fuentedeprrafopredeter"/>
+    <w:link w:val="Piedepgina"/>
     <w:uiPriority w:val="99"/>
     <w:rsid w:val="00FA5A9F"/>
     <w:rPr>
@@ -21629,7 +22101,7 @@
       <w:sz w:val="24"/>
     </w:rPr>
   </w:style>
-  <w:style w:type="paragraph" w:styleId="TOC3">
+  <w:style w:type="paragraph" w:styleId="TDC3">
     <w:name w:val="toc 3"/>
     <w:basedOn w:val="Normal"/>
     <w:next w:val="Normal"/>
@@ -21644,7 +22116,7 @@
   </w:style>
   <w:style w:type="character" w:customStyle="1" w:styleId="Mencinsinresolver1">
     <w:name w:val="Mención sin resolver1"/>
-    <w:basedOn w:val="DefaultParagraphFont"/>
+    <w:basedOn w:val="Fuentedeprrafopredeter"/>
     <w:uiPriority w:val="99"/>
     <w:semiHidden/>
     <w:unhideWhenUsed/>
@@ -21654,9 +22126,9 @@
       <w:shd w:val="clear" w:color="auto" w:fill="E1DFDD"/>
     </w:rPr>
   </w:style>
-  <w:style w:type="character" w:styleId="FollowedHyperlink">
+  <w:style w:type="character" w:styleId="Hipervnculovisitado">
     <w:name w:val="FollowedHyperlink"/>
-    <w:basedOn w:val="DefaultParagraphFont"/>
+    <w:basedOn w:val="Fuentedeprrafopredeter"/>
     <w:uiPriority w:val="99"/>
     <w:semiHidden/>
     <w:unhideWhenUsed/>
@@ -21685,7 +22157,7 @@
   </w:style>
   <w:style w:type="character" w:customStyle="1" w:styleId="UnresolvedMention1">
     <w:name w:val="Unresolved Mention1"/>
-    <w:basedOn w:val="DefaultParagraphFont"/>
+    <w:basedOn w:val="Fuentedeprrafopredeter"/>
     <w:uiPriority w:val="99"/>
     <w:semiHidden/>
     <w:unhideWhenUsed/>
@@ -21697,12 +22169,12 @@
   </w:style>
   <w:style w:type="character" w:customStyle="1" w:styleId="badge">
     <w:name w:val="badge"/>
-    <w:basedOn w:val="DefaultParagraphFont"/>
+    <w:basedOn w:val="Fuentedeprrafopredeter"/>
     <w:rsid w:val="00114AB9"/>
   </w:style>
-  <w:style w:type="character" w:styleId="UnresolvedMention">
+  <w:style w:type="character" w:styleId="Mencinsinresolver">
     <w:name w:val="Unresolved Mention"/>
-    <w:basedOn w:val="DefaultParagraphFont"/>
+    <w:basedOn w:val="Fuentedeprrafopredeter"/>
     <w:uiPriority w:val="99"/>
     <w:semiHidden/>
     <w:unhideWhenUsed/>

</xml_diff>